<commit_message>
docs(pit-ii): alinha relatorio oficial ao modelo aprovado (6 paginas) e atualiza indice no README
</commit_message>
<xml_diff>
--- a/PIT_II_Entrega_Eduardo_Maticola.docx
+++ b/PIT_II_Entrega_Eduardo_Maticola.docx
@@ -1,6 +1,6 @@
 
 <file path=word/document.xml><?xml version="1.0" encoding="utf-8"?>
-<w:document xmlns:wpc="http://schemas.microsoft.com/office/word/2010/wordprocessingCanvas" xmlns:cx="http://schemas.microsoft.com/office/drawing/2014/chartex" xmlns:cx1="http://schemas.microsoft.com/office/drawing/2015/9/8/chartex" xmlns:cx2="http://schemas.microsoft.com/office/drawing/2015/10/21/chartex" xmlns:cx3="http://schemas.microsoft.com/office/drawing/2016/5/9/chartex" xmlns:cx4="http://schemas.microsoft.com/office/drawing/2016/5/10/chartex" xmlns:cx5="http://schemas.microsoft.com/office/drawing/2016/5/11/chartex" xmlns:cx6="http://schemas.microsoft.com/office/drawing/2016/5/12/chartex" xmlns:cx7="http://schemas.microsoft.com/office/drawing/2016/5/13/chartex" xmlns:cx8="http://schemas.microsoft.com/office/drawing/2016/5/14/chartex" xmlns:mc="http://schemas.openxmlformats.org/markup-compatibility/2006" xmlns:aink="http://schemas.microsoft.com/office/drawing/2016/ink" xmlns:am3d="http://schemas.microsoft.com/office/drawing/2017/model3d" xmlns:o="urn:schemas-microsoft-com:office:office" xmlns:oel="http://schemas.microsoft.com/office/2019/extlst" xmlns:r="http://schemas.openxmlformats.org/officeDocument/2006/relationships" xmlns:m="http://schemas.openxmlformats.org/officeDocument/2006/math" xmlns:v="urn:schemas-microsoft-com:vml" xmlns:wp14="http://schemas.microsoft.com/office/word/2010/wordprocessingDrawing" xmlns:wp="http://schemas.openxmlformats.org/drawingml/2006/wordprocessingDrawing" xmlns:w10="urn:schemas-microsoft-com:office:word" xmlns:w="http://schemas.openxmlformats.org/wordprocessingml/2006/main" xmlns:w14="http://schemas.microsoft.com/office/word/2010/wordml" xmlns:w15="http://schemas.microsoft.com/office/word/2012/wordml" xmlns:w16cex="http://schemas.microsoft.com/office/word/2018/wordml/cex" xmlns:w16cid="http://schemas.microsoft.com/office/word/2016/wordml/cid" xmlns:w16="http://schemas.microsoft.com/office/word/2018/wordml" xmlns:w16sdtdh="http://schemas.microsoft.com/office/word/2020/wordml/sdtdatahash" xmlns:w16se="http://schemas.microsoft.com/office/word/2015/wordml/symex" xmlns:wpg="http://schemas.microsoft.com/office/word/2010/wordprocessingGroup" xmlns:wpi="http://schemas.microsoft.com/office/word/2010/wordprocessingInk" xmlns:wne="http://schemas.microsoft.com/office/word/2006/wordml" xmlns:wps="http://schemas.microsoft.com/office/word/2010/wordprocessingShape" mc:Ignorable="w14 w15 w16se w16cid w16 w16cex w16sdtdh wp14">
+<w:document xmlns:wpc="http://schemas.microsoft.com/office/word/2010/wordprocessingCanvas" xmlns:cx="http://schemas.microsoft.com/office/drawing/2014/chartex" xmlns:cx1="http://schemas.microsoft.com/office/drawing/2015/9/8/chartex" xmlns:cx2="http://schemas.microsoft.com/office/drawing/2015/10/21/chartex" xmlns:cx3="http://schemas.microsoft.com/office/drawing/2016/5/9/chartex" xmlns:cx4="http://schemas.microsoft.com/office/drawing/2016/5/10/chartex" xmlns:cx5="http://schemas.microsoft.com/office/drawing/2016/5/11/chartex" xmlns:cx6="http://schemas.microsoft.com/office/drawing/2016/5/12/chartex" xmlns:cx7="http://schemas.microsoft.com/office/drawing/2016/5/13/chartex" xmlns:cx8="http://schemas.microsoft.com/office/drawing/2016/5/14/chartex" xmlns:mc="http://schemas.openxmlformats.org/markup-compatibility/2006" xmlns:aink="http://schemas.microsoft.com/office/drawing/2016/ink" xmlns:am3d="http://schemas.microsoft.com/office/drawing/2017/model3d" xmlns:o="urn:schemas-microsoft-com:office:office" xmlns:oel="http://schemas.microsoft.com/office/2019/extlst" xmlns:r="http://schemas.openxmlformats.org/officeDocument/2006/relationships" xmlns:m="http://schemas.openxmlformats.org/officeDocument/2006/math" xmlns:v="urn:schemas-microsoft-com:vml" xmlns:wp14="http://schemas.microsoft.com/office/word/2010/wordprocessingDrawing" xmlns:wp="http://schemas.openxmlformats.org/drawingml/2006/wordprocessingDrawing" xmlns:w10="urn:schemas-microsoft-com:office:word" xmlns:w="http://schemas.openxmlformats.org/wordprocessingml/2006/main" xmlns:w14="http://schemas.microsoft.com/office/word/2010/wordml" xmlns:w15="http://schemas.microsoft.com/office/word/2012/wordml" xmlns:w16cex="http://schemas.microsoft.com/office/word/2018/wordml/cex" xmlns:w16cid="http://schemas.microsoft.com/office/word/2016/wordml/cid" xmlns:w16="http://schemas.microsoft.com/office/word/2018/wordml" xmlns:w16du="http://schemas.microsoft.com/office/word/2023/wordml/word16du" xmlns:w16sdtdh="http://schemas.microsoft.com/office/word/2020/wordml/sdtdatahash" xmlns:w16sdtfl="http://schemas.microsoft.com/office/word/2024/wordml/sdtformatlock" xmlns:w16se="http://schemas.microsoft.com/office/word/2015/wordml/symex" xmlns:wpg="http://schemas.microsoft.com/office/word/2010/wordprocessingGroup" xmlns:wpi="http://schemas.microsoft.com/office/word/2010/wordprocessingInk" xmlns:wne="http://schemas.microsoft.com/office/word/2006/wordml" xmlns:wps="http://schemas.microsoft.com/office/word/2010/wordprocessingShape" mc:Ignorable="w14 w15 w16se w16cid w16 w16cex w16sdtdh w16sdtfl w16du wp14">
   <w:body>
     <w:p>
       <w:pPr>
@@ -103,17 +103,27 @@
         <w:rPr>
           <w:rFonts w:ascii="Arial" w:hAnsi="Arial"/>
           <w:b/>
-          <w:sz w:val="22"/>
-        </w:rPr>
-        <w:t xml:space="preserve">Nome: </w:t>
-      </w:r>
+          <w:i w:val="0"/>
+        </w:rPr>
+        <w:t>Nome: Eduardo Marcelo Pacheco Maticola</w:t>
+      </w:r>
+    </w:p>
+    <w:p>
+      <w:pPr>
+        <w:spacing w:after="0" w:line="360" w:lineRule="auto"/>
+        <w:rPr>
+          <w:rFonts w:ascii="Arial" w:hAnsi="Arial" w:cs="Arial"/>
+          <w:b/>
+          <w:bCs/>
+        </w:rPr>
+      </w:pPr>
       <w:r>
         <w:rPr>
           <w:rFonts w:ascii="Arial" w:hAnsi="Arial"/>
-          <w:b w:val="0"/>
-          <w:sz w:val="22"/>
-        </w:rPr>
-        <w:t>Eduardo Marcelo Pacheco Maticola</w:t>
+          <w:b/>
+          <w:i w:val="0"/>
+        </w:rPr>
+        <w:t>RGM: 34652671</w:t>
       </w:r>
     </w:p>
     <w:p>
@@ -125,189 +135,118 @@
           <w:bCs/>
         </w:rPr>
       </w:pPr>
+    </w:p>
+    <w:p>
+      <w:pPr>
+        <w:spacing w:after="0" w:line="360" w:lineRule="auto"/>
+        <w:rPr>
+          <w:rFonts w:ascii="Arial" w:hAnsi="Arial" w:cs="Arial"/>
+          <w:b/>
+          <w:bCs/>
+        </w:rPr>
+      </w:pPr>
+      <w:r>
+        <w:rPr>
+          <w:rFonts w:ascii="Arial" w:hAnsi="Arial" w:cs="Arial"/>
+          <w:b/>
+          <w:bCs/>
+        </w:rPr>
+        <w:t>Documentação:</w:t>
+      </w:r>
+    </w:p>
+    <w:p>
+      <w:pPr>
+        <w:spacing w:after="0" w:line="360" w:lineRule="auto"/>
+        <w:jc w:val="both"/>
+        <w:rPr>
+          <w:rFonts w:ascii="Arial" w:hAnsi="Arial" w:cs="Arial"/>
+        </w:rPr>
+      </w:pPr>
+      <w:r>
+        <w:rPr>
+          <w:rFonts w:ascii="Arial" w:hAnsi="Arial" w:cs="Arial"/>
+        </w:rPr>
+        <w:t>Revisite a documentação do projeto desenvolvido na PIT I</w:t>
+      </w:r>
+      <w:r>
+        <w:rPr>
+          <w:rFonts w:ascii="Arial" w:hAnsi="Arial" w:cs="Arial"/>
+        </w:rPr>
+        <w:t>, faça as atualizações e melhorias necessárias de acordo com os pontos explicitados no material teórico. Ao terminar os ajustes</w:t>
+      </w:r>
+      <w:r>
+        <w:rPr>
+          <w:rFonts w:ascii="Arial" w:hAnsi="Arial" w:cs="Arial"/>
+        </w:rPr>
+        <w:t>,</w:t>
+      </w:r>
+      <w:r>
+        <w:rPr>
+          <w:rFonts w:ascii="Arial" w:hAnsi="Arial" w:cs="Arial"/>
+        </w:rPr>
+        <w:t xml:space="preserve"> suba a documentação em um repositório GIT.</w:t>
+      </w:r>
+    </w:p>
+    <w:p>
+      <w:pPr>
+        <w:spacing w:after="0" w:line="360" w:lineRule="auto"/>
+        <w:rPr>
+          <w:rFonts w:ascii="Arial" w:hAnsi="Arial" w:cs="Arial"/>
+          <w:b/>
+          <w:bCs/>
+        </w:rPr>
+      </w:pPr>
       <w:r>
         <w:rPr>
           <w:rFonts w:ascii="Arial" w:hAnsi="Arial"/>
           <w:b/>
-          <w:sz w:val="22"/>
-        </w:rPr>
-        <w:t xml:space="preserve">RGM: </w:t>
+          <w:i/>
+        </w:rPr>
+        <w:t xml:space="preserve">Link </w:t>
       </w:r>
       <w:r>
         <w:rPr>
           <w:rFonts w:ascii="Arial" w:hAnsi="Arial"/>
-          <w:b w:val="0"/>
-          <w:sz w:val="22"/>
-        </w:rPr>
-        <w:t>34652671</w:t>
-      </w:r>
-    </w:p>
-    <w:p>
-      <w:pPr>
-        <w:spacing w:after="0" w:line="360" w:lineRule="auto"/>
-        <w:rPr>
-          <w:rFonts w:ascii="Arial" w:hAnsi="Arial" w:cs="Arial"/>
-          <w:b/>
-          <w:bCs/>
-        </w:rPr>
-      </w:pPr>
-    </w:p>
-    <w:p>
-      <w:pPr>
-        <w:spacing w:after="0" w:line="360" w:lineRule="auto"/>
-        <w:rPr>
-          <w:rFonts w:ascii="Arial" w:hAnsi="Arial" w:cs="Arial"/>
-          <w:b/>
-          <w:bCs/>
-        </w:rPr>
-      </w:pPr>
-      <w:r>
-        <w:rPr>
-          <w:rFonts w:ascii="Arial" w:hAnsi="Arial" w:cs="Arial"/>
-          <w:b/>
-          <w:bCs/>
-        </w:rPr>
-        <w:t>Documentação:</w:t>
-      </w:r>
-    </w:p>
-    <w:p>
-      <w:pPr>
-        <w:spacing w:after="0" w:line="360" w:lineRule="auto"/>
-        <w:jc w:val="both"/>
-        <w:rPr>
-          <w:rFonts w:ascii="Arial" w:hAnsi="Arial" w:cs="Arial"/>
-        </w:rPr>
-      </w:pPr>
-      <w:r>
-        <w:rPr>
-          <w:rFonts w:ascii="Arial" w:hAnsi="Arial" w:cs="Arial"/>
-        </w:rPr>
-        <w:t>Revisite a documentação do projeto desenvolvido na PIT I</w:t>
-      </w:r>
-      <w:r>
-        <w:rPr>
-          <w:rFonts w:ascii="Arial" w:hAnsi="Arial" w:cs="Arial"/>
-        </w:rPr>
-        <w:t>, faça as atualizações e melhorias necessárias de acordo com os pontos explicitados no material teórico. Ao terminar os ajustes</w:t>
-      </w:r>
-      <w:r>
-        <w:rPr>
-          <w:rFonts w:ascii="Arial" w:hAnsi="Arial" w:cs="Arial"/>
-        </w:rPr>
-        <w:t>,</w:t>
-      </w:r>
-      <w:r>
-        <w:rPr>
-          <w:rFonts w:ascii="Arial" w:hAnsi="Arial" w:cs="Arial"/>
-        </w:rPr>
-        <w:t xml:space="preserve"> suba a documentação em um repositório GIT.</w:t>
-      </w:r>
-    </w:p>
-    <w:p>
-      <w:pPr>
-        <w:spacing w:after="0" w:line="360" w:lineRule="auto"/>
-        <w:rPr>
-          <w:rFonts w:ascii="Arial" w:hAnsi="Arial" w:cs="Arial"/>
-          <w:b/>
-          <w:bCs/>
-        </w:rPr>
-      </w:pPr>
-      <w:r>
-        <w:rPr>
-          <w:rFonts w:ascii="Arial" w:hAnsi="Arial"/>
-          <w:b/>
-          <w:sz w:val="21"/>
-        </w:rPr>
-        <w:t xml:space="preserve">Link do repositório: </w:t>
-      </w:r>
-      <w:r>
-        <w:rPr>
-          <w:rFonts w:ascii="Arial" w:hAnsi="Arial"/>
-          <w:b w:val="0"/>
-          <w:sz w:val="21"/>
-        </w:rPr>
-        <w:br/>
-        <w:t>• Repositório Front-end &amp; Documentação Completa (/docs): https://github.com/KonoDoardoDa/ShelfApp</w:t>
-        <w:br/>
-        <w:t>• Repositório Back-end (API .NET 9): https://github.com/KonoDoardoDa/ShelfAPI</w:t>
-        <w:br/>
-        <w:t>• Pasta de Documentação das Situações 1, 2 e 3: https://github.com/KonoDoardoDa/ShelfApp/tree/main/docs</w:t>
-      </w:r>
-    </w:p>
-    <w:p>
-      <w:pPr>
-        <w:spacing w:after="0" w:line="360" w:lineRule="auto"/>
-        <w:rPr>
-          <w:rFonts w:ascii="Arial" w:hAnsi="Arial" w:cs="Arial"/>
-        </w:rPr>
-      </w:pPr>
-      <w:r>
-        <w:rPr>
-          <w:rFonts w:ascii="Arial" w:hAnsi="Arial"/>
-          <w:b/>
-          <w:sz w:val="20"/>
-        </w:rPr>
-        <w:t>1. Escopo Revisado (Ciclo Kaizen) e Modelagem UML (Situação-Problema 1):</w:t>
-        <w:br/>
-      </w:r>
-      <w:r>
-        <w:rPr>
-          <w:rFonts w:ascii="Arial" w:hAnsi="Arial"/>
-          <w:b w:val="0"/>
-          <w:sz w:val="20"/>
-        </w:rPr>
-        <w:t>O projeto ShelfApp ERP (Sistema Integrado de Gestão de Almoxarifado Industrial, Manufatura de Kits BOM e Planejamento de Demanda) foi revisado sob a filosofia Kaizen para eliminar gargalos reais na fabricação de painéis elétricos e máquinas industriais. Na modelagem UML (disponível em docs/Situacao-Problema-1/02-Modelagem-UML.md), foram elaborados: (a) Diagrama de Classes de Domínio e Persistência contemplando as 10 entidades do sistema (Usuario, Fornecedor, Item, Estoque, MovimentacaoEstoque, Kit, KitItem, EstoqueKit, MovimentacaoKit e Software); (b) Diagrama de Casos de Uso separando as permissões RBAC entre Operador e Administrador; (c) Diagrama de Sequência detalhando a transação atômica de montagem de kits com baixa automática de insumos; e (d) Diagrama de Atividades para o fluxo de importação automatizada de Notas Fiscais Eletrônicas via arquivo XML.</w:t>
-      </w:r>
-    </w:p>
-    <w:p>
-      <w:pPr>
-        <w:spacing w:after="0" w:line="360" w:lineRule="auto"/>
-        <w:rPr>
-          <w:rFonts w:ascii="Arial" w:hAnsi="Arial" w:cs="Arial"/>
-        </w:rPr>
-      </w:pPr>
-      <w:r>
-        <w:rPr>
-          <w:rFonts w:ascii="Arial" w:hAnsi="Arial"/>
-          <w:b/>
-          <w:sz w:val="20"/>
-        </w:rPr>
-        <w:t>2. Adequação de IHC / UX (Interface Humano-Computador):</w:t>
-        <w:br/>
-      </w:r>
-      <w:r>
-        <w:rPr>
-          <w:rFonts w:ascii="Arial" w:hAnsi="Arial"/>
-          <w:b w:val="0"/>
-          <w:sz w:val="20"/>
-        </w:rPr>
-        <w:t>Aplicando as heurísticas de Don Norman e as diretrizes da Usability.gov (documentadas em docs/Situacao-Problema-1/03-Projeto-IHC-e-UX.md), a interface foi projetada com foco em: (a) Clareza e Consistência: badges semânticos por cores (Verde para estoque regular &gt; 10 un, Âmbar para baixo estoque de 1 a 10 un e Vermelho para itens esgotados 0 un); (b) Divulgação Progressiva e Simplicidade: listagens enxutas com detalhes de composição BOM e auditoria em janelas modais sob demanda; (c) Controle e Reversibilidade: função de Desmontar Kit (estornando 100% dos componentes ao almoxarifado em caso de erro operacional) e opção de Inativar registros em vez de exclusão destrutiva; (d) Feedback Imediato e Conforto Visual: prévia matemática de saldo antes da confirmação, notificações flutuantes (Toasts) e alternância nativa entre Modo Claro e Modo Escuro.</w:t>
-      </w:r>
-    </w:p>
-    <w:p>
-      <w:pPr>
-        <w:spacing w:after="0" w:line="360" w:lineRule="auto"/>
-        <w:rPr>
-          <w:rFonts w:ascii="Arial" w:hAnsi="Arial" w:cs="Arial"/>
-        </w:rPr>
-      </w:pPr>
-      <w:r>
-        <w:rPr>
-          <w:rFonts w:ascii="Arial" w:hAnsi="Arial"/>
-          <w:b/>
-          <w:sz w:val="20"/>
-        </w:rPr>
-        <w:t>3. Projeto Conceitual, Lógico Normalizado (DER), Físico e Dicionário de Dados:</w:t>
-        <w:br/>
-      </w:r>
-      <w:r>
-        <w:rPr>
-          <w:rFonts w:ascii="Arial" w:hAnsi="Arial"/>
-          <w:b w:val="0"/>
-          <w:sz w:val="20"/>
-        </w:rPr>
-        <w:t>O banco de dados relacional foi implementado no SGBD MySQL 8.0 (InnoDB, utf8mb4) em conformidade com a 1ª, 2ª e 3ª Formas Normais (3FN). O Dicionário de Dados completo e os scripts DDL SQL encontram-se em docs/Situacao-Problema-1/04-Projeto-Banco-de-Dados-e-Dicionario.md, abrangendo as 10 tabelas físicas: fornecedor (Id PK, Nome UK, Ativo), item (Id PK, Nome UK, Descricao, FornecedorId FK, Ativo), estoque (itemId PK/FK, quantidade), movimentacao_estoque (id PK, itemId FK, tipo, quantidade, saldoAnterior, saldoPosterior, motivo, notaFiscal, usuarioId, usuarioNome, dataMovimentacao), kit (Id PK, Nome UK, Ativo), kititem (KitId PK/FK, ItemId PK/FK, IsPainel PK, Quantidade), estoque_kit (kitId PK/FK, quantidade), movimentacao_kit (id PK, kitId FK, tipo, quantidade, saldoAnterior, saldoPosterior, motivo, usuarioId, usuarioNome, dataMovimentacao), software (Id PK, NomeSoftware, Versao, Cliente, KitId, NomeKit, TipoDispositivo, DataInstalacao, Status, Observacoes, DataCriacao) e usuario (Id PK, Nome, Email UK, SenhaHash BCrypt, Role, Ativo, DataCriacao).</w:t>
-      </w:r>
+          <w:b/>
+          <w:i w:val="0"/>
+        </w:rPr>
+        <w:t xml:space="preserve">do repositório: </w:t>
+      </w:r>
+      <w:hyperlink r:id="rId8" w:history="1">
+        <w:r>
+          <w:rPr>
+            <w:rStyle w:val="Hyperlink"/>
+            <w:rFonts w:ascii="Arial" w:hAnsi="Arial" w:cs="Arial"/>
+            <w:b/>
+            <w:bCs/>
+          </w:rPr>
+          <w:t>https://github.com/KonoDoardoDa/ShelfApp</w:t>
+        </w:r>
+      </w:hyperlink>
+    </w:p>
+    <w:p>
+      <w:pPr>
+        <w:spacing w:after="0" w:line="360" w:lineRule="auto"/>
+        <w:rPr>
+          <w:rFonts w:ascii="Arial" w:hAnsi="Arial" w:cs="Arial"/>
+        </w:rPr>
+      </w:pPr>
+    </w:p>
+    <w:p>
+      <w:pPr>
+        <w:spacing w:after="0" w:line="360" w:lineRule="auto"/>
+        <w:rPr>
+          <w:rFonts w:ascii="Arial" w:hAnsi="Arial" w:cs="Arial"/>
+        </w:rPr>
+      </w:pPr>
+    </w:p>
+    <w:p>
+      <w:pPr>
+        <w:spacing w:after="0" w:line="360" w:lineRule="auto"/>
+        <w:rPr>
+          <w:rFonts w:ascii="Arial" w:hAnsi="Arial" w:cs="Arial"/>
+        </w:rPr>
+      </w:pPr>
     </w:p>
     <w:p>
       <w:pPr>
@@ -362,41 +301,21 @@
           <w:i/>
           <w:iCs/>
         </w:rPr>
-        <w:t>front-</w:t>
-      </w:r>
-      <w:proofErr w:type="spellStart"/>
+        <w:t>front-end</w:t>
+      </w:r>
+      <w:r>
+        <w:rPr>
+          <w:rFonts w:ascii="Arial" w:hAnsi="Arial" w:cs="Arial"/>
+        </w:rPr>
+        <w:t xml:space="preserve"> e </w:t>
+      </w:r>
       <w:r>
         <w:rPr>
           <w:rFonts w:ascii="Arial" w:hAnsi="Arial" w:cs="Arial"/>
           <w:i/>
           <w:iCs/>
         </w:rPr>
-        <w:t>end</w:t>
-      </w:r>
-      <w:proofErr w:type="spellEnd"/>
-      <w:r>
-        <w:rPr>
-          <w:rFonts w:ascii="Arial" w:hAnsi="Arial" w:cs="Arial"/>
-        </w:rPr>
-        <w:t xml:space="preserve"> e </w:t>
-      </w:r>
-      <w:proofErr w:type="spellStart"/>
-      <w:r>
-        <w:rPr>
-          <w:rFonts w:ascii="Arial" w:hAnsi="Arial" w:cs="Arial"/>
-          <w:i/>
-          <w:iCs/>
-        </w:rPr>
-        <w:t>back</w:t>
-      </w:r>
-      <w:proofErr w:type="spellEnd"/>
-      <w:r>
-        <w:rPr>
-          <w:rFonts w:ascii="Arial" w:hAnsi="Arial" w:cs="Arial"/>
-          <w:i/>
-          <w:iCs/>
-        </w:rPr>
-        <w:t>-end</w:t>
+        <w:t>back-end</w:t>
       </w:r>
       <w:r>
         <w:rPr>
@@ -407,14 +326,14 @@
     </w:p>
     <w:tbl>
       <w:tblPr>
-        <w:tblStyle w:val="Tabelacomgrade"/>
+        <w:tblStyle w:val="TableGrid"/>
         <w:tblW w:w="0" w:type="auto"/>
         <w:tblInd w:w="-147" w:type="dxa"/>
         <w:tblLook w:val="04A0" w:firstRow="1" w:lastRow="0" w:firstColumn="1" w:lastColumn="0" w:noHBand="0" w:noVBand="1"/>
       </w:tblPr>
       <w:tblGrid>
-        <w:gridCol w:w="2836"/>
-        <w:gridCol w:w="5805"/>
+        <w:gridCol w:w="1633"/>
+        <w:gridCol w:w="7008"/>
       </w:tblGrid>
       <w:tr>
         <w:tc>
@@ -455,43 +374,285 @@
                 <w:i/>
                 <w:iCs/>
               </w:rPr>
-              <w:t>Back-</w:t>
-            </w:r>
-            <w:proofErr w:type="spellStart"/>
-            <w:r>
-              <w:rPr>
-                <w:rFonts w:ascii="Arial" w:hAnsi="Arial" w:cs="Arial"/>
-                <w:b/>
-                <w:bCs/>
+              <w:t>Back-end</w:t>
+            </w:r>
+          </w:p>
+        </w:tc>
+        <w:tc>
+          <w:tcPr>
+            <w:tcW w:w="5805" w:type="dxa"/>
+            <w:vAlign w:val="center"/>
+          </w:tcPr>
+          <w:p>
+            <w:pPr>
+              <w:spacing w:line="360" w:lineRule="auto"/>
+              <w:rPr>
+                <w:rFonts w:ascii="Arial" w:hAnsi="Arial" w:cs="Arial"/>
+                <w:b/>
+                <w:bCs/>
+              </w:rPr>
+            </w:pPr>
+            <w:r>
+              <w:rPr>
+                <w:rFonts w:ascii="Arial" w:hAnsi="Arial"/>
+                <w:b/>
+                <w:i w:val="0"/>
+              </w:rPr>
+              <w:t>C# / .NET 9.0 (ASP.NET Core Web API)</w:t>
+            </w:r>
+          </w:p>
+        </w:tc>
+      </w:tr>
+      <w:tr>
+        <w:tc>
+          <w:tcPr>
+            <w:tcW w:w="2836" w:type="dxa"/>
+            <w:vAlign w:val="center"/>
+          </w:tcPr>
+          <w:p>
+            <w:pPr>
+              <w:spacing w:line="360" w:lineRule="auto"/>
+              <w:rPr>
+                <w:rFonts w:ascii="Arial" w:hAnsi="Arial" w:cs="Arial"/>
+                <w:b/>
+                <w:bCs/>
+              </w:rPr>
+            </w:pPr>
+            <w:r>
+              <w:rPr>
+                <w:rFonts w:ascii="Arial" w:hAnsi="Arial" w:cs="Arial"/>
+                <w:b/>
+                <w:bCs/>
+              </w:rPr>
+              <w:t>Banco de Dados</w:t>
+            </w:r>
+          </w:p>
+        </w:tc>
+        <w:tc>
+          <w:tcPr>
+            <w:tcW w:w="5805" w:type="dxa"/>
+            <w:vAlign w:val="center"/>
+          </w:tcPr>
+          <w:p>
+            <w:pPr>
+              <w:spacing w:line="360" w:lineRule="auto"/>
+              <w:rPr>
+                <w:rFonts w:ascii="Arial" w:hAnsi="Arial" w:cs="Arial"/>
+                <w:b/>
+                <w:bCs/>
+              </w:rPr>
+            </w:pPr>
+            <w:r>
+              <w:rPr>
+                <w:rFonts w:ascii="Arial" w:hAnsi="Arial"/>
+                <w:b/>
+                <w:i w:val="0"/>
+              </w:rPr>
+              <w:t>MySQL</w:t>
+            </w:r>
+          </w:p>
+        </w:tc>
+      </w:tr>
+      <w:tr>
+        <w:tc>
+          <w:tcPr>
+            <w:tcW w:w="2836" w:type="dxa"/>
+            <w:vAlign w:val="center"/>
+          </w:tcPr>
+          <w:p>
+            <w:pPr>
+              <w:spacing w:line="360" w:lineRule="auto"/>
+              <w:rPr>
+                <w:rFonts w:ascii="Arial" w:hAnsi="Arial" w:cs="Arial"/>
+                <w:b/>
+                <w:bCs/>
+              </w:rPr>
+            </w:pPr>
+            <w:r>
+              <w:rPr>
+                <w:rFonts w:ascii="Arial" w:hAnsi="Arial" w:cs="Arial"/>
+                <w:b/>
+                <w:bCs/>
+              </w:rPr>
+              <w:t>Hospedagem</w:t>
+            </w:r>
+          </w:p>
+        </w:tc>
+        <w:tc>
+          <w:tcPr>
+            <w:tcW w:w="5805" w:type="dxa"/>
+            <w:vAlign w:val="center"/>
+          </w:tcPr>
+          <w:p>
+            <w:pPr>
+              <w:spacing w:line="360" w:lineRule="auto"/>
+              <w:rPr>
+                <w:rFonts w:ascii="Arial" w:hAnsi="Arial" w:cs="Arial"/>
+                <w:b/>
+                <w:bCs/>
+              </w:rPr>
+            </w:pPr>
+            <w:r>
+              <w:rPr>
+                <w:rFonts w:ascii="Arial" w:hAnsi="Arial"/>
+                <w:b/>
+                <w:i w:val="0"/>
+              </w:rPr>
+              <w:t>Vercel (Front-end), Render com Docker (API) e Aiven Cloud (MySQL) com HTTPS</w:t>
+            </w:r>
+          </w:p>
+        </w:tc>
+      </w:tr>
+      <w:tr>
+        <w:tc>
+          <w:tcPr>
+            <w:tcW w:w="2836" w:type="dxa"/>
+            <w:vAlign w:val="center"/>
+          </w:tcPr>
+          <w:p>
+            <w:pPr>
+              <w:spacing w:line="360" w:lineRule="auto"/>
+              <w:rPr>
+                <w:rFonts w:ascii="Arial" w:hAnsi="Arial" w:cs="Arial"/>
+                <w:b/>
+                <w:bCs/>
+              </w:rPr>
+            </w:pPr>
+            <w:r>
+              <w:rPr>
+                <w:rFonts w:ascii="Arial" w:hAnsi="Arial" w:cs="Arial"/>
+                <w:b/>
+                <w:bCs/>
+              </w:rPr>
+              <w:t>Plataforma</w:t>
+            </w:r>
+          </w:p>
+        </w:tc>
+        <w:tc>
+          <w:tcPr>
+            <w:tcW w:w="5805" w:type="dxa"/>
+            <w:vAlign w:val="center"/>
+          </w:tcPr>
+          <w:p>
+            <w:pPr>
+              <w:spacing w:line="360" w:lineRule="auto"/>
+              <w:rPr>
+                <w:rFonts w:ascii="Arial" w:hAnsi="Arial" w:cs="Arial"/>
+                <w:b/>
+                <w:bCs/>
+              </w:rPr>
+            </w:pPr>
+            <w:r>
+              <w:rPr>
+                <w:rFonts w:ascii="Arial" w:hAnsi="Arial"/>
+                <w:b/>
+                <w:i w:val="0"/>
+              </w:rPr>
+              <w:t>Web responsiva</w:t>
+            </w:r>
+          </w:p>
+        </w:tc>
+      </w:tr>
+      <w:tr>
+        <w:tc>
+          <w:tcPr>
+            <w:tcW w:w="2836" w:type="dxa"/>
+            <w:vAlign w:val="center"/>
+          </w:tcPr>
+          <w:p>
+            <w:pPr>
+              <w:spacing w:line="360" w:lineRule="auto"/>
+              <w:rPr>
+                <w:rFonts w:ascii="Arial" w:hAnsi="Arial" w:cs="Arial"/>
+                <w:b/>
+                <w:bCs/>
+              </w:rPr>
+            </w:pPr>
+            <w:r>
+              <w:rPr>
+                <w:rFonts w:ascii="Arial" w:hAnsi="Arial" w:cs="Arial"/>
+                <w:b/>
+                <w:bCs/>
+              </w:rPr>
+              <w:t>Modo de Codificação</w:t>
+            </w:r>
+          </w:p>
+        </w:tc>
+        <w:tc>
+          <w:tcPr>
+            <w:tcW w:w="5805" w:type="dxa"/>
+            <w:vAlign w:val="center"/>
+          </w:tcPr>
+          <w:p>
+            <w:pPr>
+              <w:spacing w:line="360" w:lineRule="auto"/>
+              <w:rPr>
+                <w:rFonts w:ascii="Arial" w:hAnsi="Arial" w:cs="Arial"/>
+              </w:rPr>
+            </w:pPr>
+            <w:r>
+              <w:rPr>
+                <w:rFonts w:ascii="Arial" w:hAnsi="Arial" w:cs="Arial"/>
+              </w:rPr>
+              <w:t xml:space="preserve">( </w:t>
+            </w:r>
+            <w:r>
+              <w:rPr>
+                <w:rFonts w:ascii="Arial" w:hAnsi="Arial" w:cs="Arial"/>
+              </w:rPr>
+              <w:t xml:space="preserve">x </w:t>
+            </w:r>
+            <w:r>
+              <w:rPr>
+                <w:rFonts w:ascii="Arial" w:hAnsi="Arial" w:cs="Arial"/>
+              </w:rPr>
+              <w:t>) Tradicional</w:t>
+            </w:r>
+          </w:p>
+          <w:p>
+            <w:pPr>
+              <w:spacing w:line="360" w:lineRule="auto"/>
+              <w:rPr>
+                <w:rFonts w:ascii="Arial" w:hAnsi="Arial" w:cs="Arial"/>
+              </w:rPr>
+            </w:pPr>
+            <w:r>
+              <w:rPr>
+                <w:rFonts w:ascii="Arial" w:hAnsi="Arial" w:cs="Arial"/>
+              </w:rPr>
+              <w:t xml:space="preserve">( ) </w:t>
+            </w:r>
+            <w:r>
+              <w:rPr>
+                <w:rFonts w:ascii="Arial" w:hAnsi="Arial" w:cs="Arial"/>
                 <w:i/>
                 <w:iCs/>
               </w:rPr>
-              <w:t>end</w:t>
-            </w:r>
-            <w:proofErr w:type="spellEnd"/>
-          </w:p>
-        </w:tc>
-        <w:tc>
-          <w:tcPr>
-            <w:tcW w:w="5805" w:type="dxa"/>
-            <w:vAlign w:val="center"/>
-          </w:tcPr>
-          <w:p>
-            <w:r/>
-            <w:r>
-              <w:rPr>
-                <w:rFonts w:ascii="Arial" w:hAnsi="Arial"/>
-                <w:b/>
-                <w:sz w:val="20"/>
-              </w:rPr>
-            </w:r>
-            <w:r>
-              <w:rPr>
-                <w:rFonts w:ascii="Arial" w:hAnsi="Arial"/>
-                <w:b w:val="0"/>
-                <w:sz w:val="20"/>
-              </w:rPr>
-              <w:t>C# / .NET 9.0 (ASP.NET Core Web API estruturada em camadas MVC/REST + Dapper Micro-ORM + Autenticação JWT Bearer + BCrypt)</w:t>
+              <w:t>Low-code</w:t>
+            </w:r>
+          </w:p>
+          <w:p>
+            <w:pPr>
+              <w:spacing w:line="360" w:lineRule="auto"/>
+              <w:rPr>
+                <w:rFonts w:ascii="Arial" w:hAnsi="Arial" w:cs="Arial"/>
+                <w:b/>
+                <w:bCs/>
+              </w:rPr>
+            </w:pPr>
+            <w:r>
+              <w:rPr>
+                <w:rFonts w:ascii="Arial" w:hAnsi="Arial" w:cs="Arial"/>
+              </w:rPr>
+              <w:t xml:space="preserve">( ) </w:t>
+            </w:r>
+            <w:r>
+              <w:rPr>
+                <w:rFonts w:ascii="Arial" w:hAnsi="Arial" w:cs="Arial"/>
+                <w:i/>
+                <w:iCs/>
+              </w:rPr>
+              <w:t>No-code</w:t>
             </w:r>
           </w:p>
         </w:tc>
@@ -516,210 +677,6 @@
                 <w:rFonts w:ascii="Arial" w:hAnsi="Arial" w:cs="Arial"/>
                 <w:b/>
                 <w:bCs/>
-              </w:rPr>
-              <w:t>Banco de Dados</w:t>
-            </w:r>
-          </w:p>
-        </w:tc>
-        <w:tc>
-          <w:tcPr>
-            <w:tcW w:w="5805" w:type="dxa"/>
-            <w:vAlign w:val="center"/>
-          </w:tcPr>
-          <w:p>
-            <w:r/>
-            <w:r>
-              <w:rPr>
-                <w:rFonts w:ascii="Arial" w:hAnsi="Arial"/>
-                <w:b/>
-                <w:sz w:val="20"/>
-              </w:rPr>
-            </w:r>
-            <w:r>
-              <w:rPr>
-                <w:rFonts w:ascii="Arial" w:hAnsi="Arial"/>
-                <w:b w:val="0"/>
-                <w:sz w:val="20"/>
-              </w:rPr>
-              <w:t>MySQL 8.0 (InnoDB Relacional com suporte a transações ACID)</w:t>
-            </w:r>
-          </w:p>
-        </w:tc>
-      </w:tr>
-      <w:tr>
-        <w:tc>
-          <w:tcPr>
-            <w:tcW w:w="2836" w:type="dxa"/>
-            <w:vAlign w:val="center"/>
-          </w:tcPr>
-          <w:p>
-            <w:pPr>
-              <w:spacing w:line="360" w:lineRule="auto"/>
-              <w:rPr>
-                <w:rFonts w:ascii="Arial" w:hAnsi="Arial" w:cs="Arial"/>
-                <w:b/>
-                <w:bCs/>
-              </w:rPr>
-            </w:pPr>
-            <w:r>
-              <w:rPr>
-                <w:rFonts w:ascii="Arial" w:hAnsi="Arial" w:cs="Arial"/>
-                <w:b/>
-                <w:bCs/>
-              </w:rPr>
-              <w:t>Hospedagem</w:t>
-            </w:r>
-          </w:p>
-        </w:tc>
-        <w:tc>
-          <w:tcPr>
-            <w:tcW w:w="5805" w:type="dxa"/>
-            <w:vAlign w:val="center"/>
-          </w:tcPr>
-          <w:p>
-            <w:r/>
-            <w:r>
-              <w:rPr>
-                <w:rFonts w:ascii="Arial" w:hAnsi="Arial"/>
-                <w:b/>
-                <w:sz w:val="20"/>
-              </w:rPr>
-            </w:r>
-            <w:r>
-              <w:rPr>
-                <w:rFonts w:ascii="Arial" w:hAnsi="Arial"/>
-                <w:b w:val="0"/>
-                <w:sz w:val="20"/>
-              </w:rPr>
-              <w:t>Front-end na Vercel | Back-end conteinerizado com Docker no Render | Banco de Dados MySQL na Aiven Cloud</w:t>
-            </w:r>
-          </w:p>
-        </w:tc>
-      </w:tr>
-      <w:tr>
-        <w:tc>
-          <w:tcPr>
-            <w:tcW w:w="2836" w:type="dxa"/>
-            <w:vAlign w:val="center"/>
-          </w:tcPr>
-          <w:p>
-            <w:pPr>
-              <w:spacing w:line="360" w:lineRule="auto"/>
-              <w:rPr>
-                <w:rFonts w:ascii="Arial" w:hAnsi="Arial" w:cs="Arial"/>
-                <w:b/>
-                <w:bCs/>
-              </w:rPr>
-            </w:pPr>
-            <w:r>
-              <w:rPr>
-                <w:rFonts w:ascii="Arial" w:hAnsi="Arial" w:cs="Arial"/>
-                <w:b/>
-                <w:bCs/>
-              </w:rPr>
-              <w:t>Plataforma</w:t>
-            </w:r>
-          </w:p>
-        </w:tc>
-        <w:tc>
-          <w:tcPr>
-            <w:tcW w:w="5805" w:type="dxa"/>
-            <w:vAlign w:val="center"/>
-          </w:tcPr>
-          <w:p>
-            <w:r/>
-            <w:r>
-              <w:rPr>
-                <w:rFonts w:ascii="Arial" w:hAnsi="Arial"/>
-                <w:b/>
-                <w:sz w:val="20"/>
-              </w:rPr>
-            </w:r>
-            <w:r>
-              <w:rPr>
-                <w:rFonts w:ascii="Arial" w:hAnsi="Arial"/>
-                <w:b w:val="0"/>
-                <w:sz w:val="20"/>
-              </w:rPr>
-              <w:t>Aplicação Web Responsiva (SPA em React 19 + TypeScript 5 + Vite 7 + HTML5/CSS3)</w:t>
-            </w:r>
-          </w:p>
-        </w:tc>
-      </w:tr>
-      <w:tr>
-        <w:tc>
-          <w:tcPr>
-            <w:tcW w:w="2836" w:type="dxa"/>
-            <w:vAlign w:val="center"/>
-          </w:tcPr>
-          <w:p>
-            <w:pPr>
-              <w:spacing w:line="360" w:lineRule="auto"/>
-              <w:rPr>
-                <w:rFonts w:ascii="Arial" w:hAnsi="Arial" w:cs="Arial"/>
-                <w:b/>
-                <w:bCs/>
-              </w:rPr>
-            </w:pPr>
-            <w:r>
-              <w:rPr>
-                <w:rFonts w:ascii="Arial" w:hAnsi="Arial" w:cs="Arial"/>
-                <w:b/>
-                <w:bCs/>
-              </w:rPr>
-              <w:t>Modo de Codificação</w:t>
-            </w:r>
-          </w:p>
-        </w:tc>
-        <w:tc>
-          <w:tcPr>
-            <w:tcW w:w="5805" w:type="dxa"/>
-            <w:vAlign w:val="center"/>
-          </w:tcPr>
-          <w:p>
-            <w:r/>
-            <w:r>
-              <w:rPr>
-                <w:rFonts w:ascii="Arial" w:hAnsi="Arial"/>
-                <w:b/>
-                <w:sz w:val="20"/>
-              </w:rPr>
-            </w:r>
-            <w:r>
-              <w:rPr>
-                <w:rFonts w:ascii="Arial" w:hAnsi="Arial"/>
-                <w:b w:val="0"/>
-                <w:sz w:val="20"/>
-              </w:rPr>
-              <w:t>( X ) Tradicional</w:t>
-              <w:br/>
-              <w:t>(   ) Low-code</w:t>
-              <w:br/>
-              <w:t>(   ) No-code</w:t>
-            </w:r>
-          </w:p>
-        </w:tc>
-      </w:tr>
-      <w:tr>
-        <w:tc>
-          <w:tcPr>
-            <w:tcW w:w="2836" w:type="dxa"/>
-            <w:vAlign w:val="center"/>
-          </w:tcPr>
-          <w:p>
-            <w:pPr>
-              <w:spacing w:line="360" w:lineRule="auto"/>
-              <w:rPr>
-                <w:rFonts w:ascii="Arial" w:hAnsi="Arial" w:cs="Arial"/>
-                <w:b/>
-                <w:bCs/>
-              </w:rPr>
-            </w:pPr>
-            <w:r>
-              <w:rPr>
-                <w:rFonts w:ascii="Arial" w:hAnsi="Arial" w:cs="Arial"/>
-                <w:b/>
-                <w:bCs/>
                 <w:i/>
                 <w:iCs/>
               </w:rPr>
@@ -733,7 +690,7 @@
               </w:rPr>
               <w:t xml:space="preserve">do repositório no </w:t>
             </w:r>
-            <w:hyperlink r:id="rId8" w:history="1">
+            <w:hyperlink r:id="rId9" w:history="1">
               <w:r>
                 <w:rPr>
                   <w:rStyle w:val="Hyperlink"/>
@@ -760,24 +717,23 @@
             <w:vAlign w:val="center"/>
           </w:tcPr>
           <w:p>
-            <w:r/>
-            <w:r>
-              <w:rPr>
-                <w:rFonts w:ascii="Arial" w:hAnsi="Arial"/>
-                <w:b/>
-                <w:sz w:val="20"/>
-              </w:rPr>
-            </w:r>
-            <w:r>
-              <w:rPr>
-                <w:rFonts w:ascii="Arial" w:hAnsi="Arial"/>
-                <w:b w:val="0"/>
-                <w:sz w:val="20"/>
-              </w:rPr>
-              <w:t>Front-end e Docs: https://github.com/KonoDoardoDa/ShelfApp</w:t>
-              <w:br/>
-              <w:t>Back-end (.NET 9): https://github.com/KonoDoardoDa/ShelfAPI</w:t>
-            </w:r>
+            <w:pPr>
+              <w:spacing w:line="360" w:lineRule="auto"/>
+              <w:rPr>
+                <w:rFonts w:ascii="Arial" w:hAnsi="Arial" w:cs="Arial"/>
+              </w:rPr>
+            </w:pPr>
+            <w:hyperlink r:id="rId10" w:history="1">
+              <w:r>
+                <w:rPr>
+                  <w:rStyle w:val="Hyperlink"/>
+                  <w:rFonts w:ascii="Arial" w:hAnsi="Arial" w:cs="Arial"/>
+                  <w:b/>
+                  <w:bCs/>
+                </w:rPr>
+                <w:t>https://github.com/KonoDoardoDa/ShelfApp</w:t>
+              </w:r>
+            </w:hyperlink>
           </w:p>
         </w:tc>
       </w:tr>
@@ -838,24 +794,23 @@
             <w:vAlign w:val="center"/>
           </w:tcPr>
           <w:p>
-            <w:r/>
-            <w:r>
-              <w:rPr>
-                <w:rFonts w:ascii="Arial" w:hAnsi="Arial"/>
-                <w:b/>
-                <w:sz w:val="20"/>
-              </w:rPr>
-            </w:r>
-            <w:r>
-              <w:rPr>
-                <w:rFonts w:ascii="Arial" w:hAnsi="Arial"/>
-                <w:b w:val="0"/>
-                <w:sz w:val="20"/>
-              </w:rPr>
-              <w:t>Aplicação Web (Vercel): https://shelf-app.vercel.app</w:t>
-              <w:br/>
-              <w:t>API &amp; Swagger (Render): https://shelfapi.onrender.com/swagger</w:t>
-            </w:r>
+            <w:pPr>
+              <w:spacing w:line="360" w:lineRule="auto"/>
+              <w:rPr>
+                <w:rFonts w:ascii="Arial" w:hAnsi="Arial" w:cs="Arial"/>
+              </w:rPr>
+            </w:pPr>
+            <w:hyperlink r:id="rId11" w:history="1">
+              <w:r>
+                <w:rPr>
+                  <w:rStyle w:val="Hyperlink"/>
+                  <w:rFonts w:ascii="Arial" w:hAnsi="Arial" w:cs="Arial"/>
+                  <w:b/>
+                  <w:bCs/>
+                </w:rPr>
+                <w:t>https://shelf-app.vercel.app/</w:t>
+              </w:r>
+            </w:hyperlink>
           </w:p>
         </w:tc>
       </w:tr>
@@ -926,22 +881,23 @@
             <w:vAlign w:val="center"/>
           </w:tcPr>
           <w:p>
-            <w:r/>
-            <w:r>
-              <w:rPr>
-                <w:rFonts w:ascii="Arial" w:hAnsi="Arial"/>
-                <w:b/>
-                <w:sz w:val="20"/>
-              </w:rPr>
-            </w:r>
-            <w:r>
-              <w:rPr>
-                <w:rFonts w:ascii="Arial" w:hAnsi="Arial"/>
-                <w:b w:val="0"/>
-                <w:sz w:val="20"/>
-              </w:rPr>
-              <w:t>[Inserir Link do Vídeo Gravado Aqui]</w:t>
-            </w:r>
+            <w:pPr>
+              <w:spacing w:line="360" w:lineRule="auto"/>
+              <w:rPr>
+                <w:rFonts w:ascii="Arial" w:hAnsi="Arial" w:cs="Arial"/>
+              </w:rPr>
+            </w:pPr>
+            <w:hyperlink r:id="rId12" w:history="1">
+              <w:r>
+                <w:rPr>
+                  <w:rStyle w:val="Hyperlink"/>
+                  <w:rFonts w:ascii="Arial" w:hAnsi="Arial" w:cs="Arial"/>
+                  <w:b/>
+                  <w:bCs/>
+                </w:rPr>
+                <w:t>[Inserir link do vídeo narrado (Google Drive / YouTube)]</w:t>
+              </w:r>
+            </w:hyperlink>
           </w:p>
         </w:tc>
       </w:tr>
@@ -1010,7 +966,7 @@
     </w:p>
     <w:tbl>
       <w:tblPr>
-        <w:tblStyle w:val="Tabelacomgrade"/>
+        <w:tblStyle w:val="TableGrid"/>
         <w:tblW w:w="9587" w:type="dxa"/>
         <w:tblLook w:val="04A0" w:firstRow="1" w:lastRow="0" w:firstColumn="1" w:lastColumn="0" w:noHBand="0" w:noVBand="1"/>
       </w:tblPr>
@@ -1027,12 +983,19 @@
             <w:tcW w:w="5165" w:type="dxa"/>
           </w:tcPr>
           <w:p>
-            <w:r/>
-            <w:r>
-              <w:rPr>
-                <w:rFonts w:ascii="Arial" w:hAnsi="Arial"/>
-                <w:b/>
-                <w:sz w:val="20"/>
+            <w:pPr>
+              <w:spacing w:line="360" w:lineRule="auto"/>
+              <w:rPr>
+                <w:rFonts w:ascii="Arial" w:hAnsi="Arial" w:cs="Arial"/>
+                <w:b/>
+                <w:bCs/>
+              </w:rPr>
+            </w:pPr>
+            <w:r>
+              <w:rPr>
+                <w:rFonts w:ascii="Arial" w:hAnsi="Arial"/>
+                <w:b/>
+                <w:i w:val="0"/>
               </w:rPr>
               <w:t xml:space="preserve">Nome: </w:t>
             </w:r>
@@ -1040,7 +1003,7 @@
               <w:rPr>
                 <w:rFonts w:ascii="Arial" w:hAnsi="Arial"/>
                 <w:b w:val="0"/>
-                <w:sz w:val="20"/>
+                <w:i w:val="0"/>
               </w:rPr>
               <w:t>Matheus Bieberbach</w:t>
             </w:r>
@@ -1051,12 +1014,19 @@
             <w:tcW w:w="4422" w:type="dxa"/>
           </w:tcPr>
           <w:p>
-            <w:r/>
-            <w:r>
-              <w:rPr>
-                <w:rFonts w:ascii="Arial" w:hAnsi="Arial"/>
-                <w:b/>
-                <w:sz w:val="20"/>
+            <w:pPr>
+              <w:spacing w:line="360" w:lineRule="auto"/>
+              <w:rPr>
+                <w:rFonts w:ascii="Arial" w:hAnsi="Arial" w:cs="Arial"/>
+                <w:b/>
+                <w:bCs/>
+              </w:rPr>
+            </w:pPr>
+            <w:r>
+              <w:rPr>
+                <w:rFonts w:ascii="Arial" w:hAnsi="Arial"/>
+                <w:b/>
+                <w:i w:val="0"/>
               </w:rPr>
               <w:t xml:space="preserve">Data do teste: </w:t>
             </w:r>
@@ -1064,7 +1034,7 @@
               <w:rPr>
                 <w:rFonts w:ascii="Arial" w:hAnsi="Arial"/>
                 <w:b w:val="0"/>
-                <w:sz w:val="20"/>
+                <w:i w:val="0"/>
               </w:rPr>
               <w:t>14/10/2026</w:t>
             </w:r>
@@ -1081,23 +1051,37 @@
             <w:gridSpan w:val="2"/>
           </w:tcPr>
           <w:p>
-            <w:r/>
-            <w:r>
-              <w:rPr>
-                <w:rFonts w:ascii="Arial" w:hAnsi="Arial"/>
-                <w:b/>
-                <w:sz w:val="20"/>
+            <w:pPr>
+              <w:spacing w:line="360" w:lineRule="auto"/>
+              <w:rPr>
+                <w:rFonts w:ascii="Arial" w:hAnsi="Arial" w:cs="Arial"/>
+                <w:b/>
+                <w:bCs/>
+              </w:rPr>
+            </w:pPr>
+            <w:r>
+              <w:rPr>
+                <w:rFonts w:ascii="Arial" w:hAnsi="Arial"/>
+                <w:b/>
+                <w:i w:val="0"/>
               </w:rPr>
               <w:t>O que testou e funcionou:</w:t>
-              <w:br/>
+            </w:r>
+            <w:r>
+              <w:rPr>
+                <w:rFonts w:ascii="Arial" w:hAnsi="Arial"/>
+                <w:b/>
+                <w:i w:val="0"/>
+              </w:rPr>
+              <w:t xml:space="preserve"> </w:t>
             </w:r>
             <w:r>
               <w:rPr>
                 <w:rFonts w:ascii="Arial" w:hAnsi="Arial"/>
                 <w:b w:val="0"/>
-                <w:sz w:val="20"/>
-              </w:rPr>
-              <w:t>Testou o fluxo de Login com autenticação JWT, a visualização dos indicadores executivos (KPIs) no Dashboard Principal, os filtros rápidos do Monitor de Reposição Crítica (Todos, Zerados e Baixo Estoque) e o cadastro manual de Fornecedores e Peças no Almoxarifado. Validou a rapidez da busca instantânea e a clareza visual dos indicadores de criticidade (verde, âmbar e vermelho).</w:t>
+                <w:i w:val="0"/>
+              </w:rPr>
+              <w:t>Foi realizado o login no sistema com autenticação JWT e testada a visualização dos indicadores no Dashboard Principal, incluindo os filtros rápidos do Monitor de Reposição Crítica (Todos, Zerados e Baixo Estoque). Também foram realizados o cadastro manual de fornecedores e peças no almoxarifado e a movimentação de entrada e saída de itens. O saldo e os alertas visuais de criticidade foram atualizados corretamente.</w:t>
             </w:r>
           </w:p>
         </w:tc>
@@ -1112,23 +1096,37 @@
             <w:gridSpan w:val="2"/>
           </w:tcPr>
           <w:p>
-            <w:r/>
-            <w:r>
-              <w:rPr>
-                <w:rFonts w:ascii="Arial" w:hAnsi="Arial"/>
-                <w:b/>
-                <w:sz w:val="20"/>
+            <w:pPr>
+              <w:spacing w:line="360" w:lineRule="auto"/>
+              <w:rPr>
+                <w:rFonts w:ascii="Arial" w:hAnsi="Arial" w:cs="Arial"/>
+                <w:b/>
+                <w:bCs/>
+              </w:rPr>
+            </w:pPr>
+            <w:r>
+              <w:rPr>
+                <w:rFonts w:ascii="Arial" w:hAnsi="Arial"/>
+                <w:b/>
+                <w:i w:val="0"/>
               </w:rPr>
               <w:t>O que testou e não funcionou – O que deve ser corrigido:</w:t>
-              <w:br/>
+            </w:r>
+            <w:r>
+              <w:rPr>
+                <w:rFonts w:ascii="Arial" w:hAnsi="Arial"/>
+                <w:b/>
+                <w:i w:val="0"/>
+              </w:rPr>
+              <w:t xml:space="preserve"> </w:t>
             </w:r>
             <w:r>
               <w:rPr>
                 <w:rFonts w:ascii="Arial" w:hAnsi="Arial"/>
                 <w:b w:val="0"/>
-                <w:sz w:val="20"/>
-              </w:rPr>
-              <w:t>Ao registrar uma entrada de mercadoria recebida de fornecedor no modal de Movimentação de Estoque, sentiu falta de um campo dedicado para informar o número da Nota Fiscal (NF) separadamente da justificativa, além de apontar que cadastrar dezenas de itens de uma nota fiscal manualmente tomava muito tempo. Correção aplicada: criada a coluna 'notaFiscal' e desenvolvido o módulo de Importação em Lote via XML de NF-e.</w:t>
+                <w:i w:val="0"/>
+              </w:rPr>
+              <w:t>Não foram encontrados erros que impedissem a movimentação de estoque. Como melhoria, foi identificada a necessidade de um campo dedicado para registrar o número da Nota Fiscal separadamente da justificativa e uma opção para importar vários produtos de uma Nota Fiscal Eletrônica (XML) de uma só vez, evitando o cadastro manual item por item.</w:t>
             </w:r>
           </w:p>
         </w:tc>
@@ -1143,23 +1141,37 @@
             <w:gridSpan w:val="2"/>
           </w:tcPr>
           <w:p>
-            <w:r/>
-            <w:r>
-              <w:rPr>
-                <w:rFonts w:ascii="Arial" w:hAnsi="Arial"/>
-                <w:b/>
-                <w:sz w:val="20"/>
+            <w:pPr>
+              <w:spacing w:line="360" w:lineRule="auto"/>
+              <w:rPr>
+                <w:rFonts w:ascii="Arial" w:hAnsi="Arial" w:cs="Arial"/>
+                <w:b/>
+                <w:bCs/>
+              </w:rPr>
+            </w:pPr>
+            <w:r>
+              <w:rPr>
+                <w:rFonts w:ascii="Arial" w:hAnsi="Arial"/>
+                <w:b/>
+                <w:i w:val="0"/>
               </w:rPr>
               <w:t>Funcionalidade não testada (faltou ou não foi implementada):</w:t>
-              <w:br/>
+            </w:r>
+            <w:r>
+              <w:rPr>
+                <w:rFonts w:ascii="Arial" w:hAnsi="Arial"/>
+                <w:b/>
+                <w:i w:val="0"/>
+              </w:rPr>
+              <w:t xml:space="preserve"> </w:t>
             </w:r>
             <w:r>
               <w:rPr>
                 <w:rFonts w:ascii="Arial" w:hAnsi="Arial"/>
                 <w:b w:val="0"/>
-                <w:sz w:val="20"/>
-              </w:rPr>
-              <w:t>Não testou a tela de Gestão de Usuários (/users) porque realizou a sessão de testes utilizando uma conta com perfil 'Operador', que possui bloqueio de segurança (RBAC) para rotas exclusivas de Administrador.</w:t>
+                <w:i w:val="0"/>
+              </w:rPr>
+              <w:t>Não foi testada a tela de Gestão de Usuários, pois o teste foi realizado utilizando um perfil de Operador, que possui restrição de acesso às funcionalidades exclusivas de Administrador.</w:t>
             </w:r>
           </w:p>
         </w:tc>
@@ -1175,7 +1187,7 @@
     </w:p>
     <w:tbl>
       <w:tblPr>
-        <w:tblStyle w:val="Tabelacomgrade"/>
+        <w:tblStyle w:val="TableGrid"/>
         <w:tblW w:w="9587" w:type="dxa"/>
         <w:tblLook w:val="04A0" w:firstRow="1" w:lastRow="0" w:firstColumn="1" w:lastColumn="0" w:noHBand="0" w:noVBand="1"/>
       </w:tblPr>
@@ -1192,12 +1204,19 @@
             <w:tcW w:w="5165" w:type="dxa"/>
           </w:tcPr>
           <w:p>
-            <w:r/>
-            <w:r>
-              <w:rPr>
-                <w:rFonts w:ascii="Arial" w:hAnsi="Arial"/>
-                <w:b/>
-                <w:sz w:val="20"/>
+            <w:pPr>
+              <w:spacing w:line="360" w:lineRule="auto"/>
+              <w:rPr>
+                <w:rFonts w:ascii="Arial" w:hAnsi="Arial" w:cs="Arial"/>
+                <w:b/>
+                <w:bCs/>
+              </w:rPr>
+            </w:pPr>
+            <w:r>
+              <w:rPr>
+                <w:rFonts w:ascii="Arial" w:hAnsi="Arial"/>
+                <w:b/>
+                <w:i w:val="0"/>
               </w:rPr>
               <w:t xml:space="preserve">Nome: </w:t>
             </w:r>
@@ -1205,7 +1224,7 @@
               <w:rPr>
                 <w:rFonts w:ascii="Arial" w:hAnsi="Arial"/>
                 <w:b w:val="0"/>
-                <w:sz w:val="20"/>
+                <w:i w:val="0"/>
               </w:rPr>
               <w:t>Jhenifer Tavares Ribeiro</w:t>
             </w:r>
@@ -1216,12 +1235,19 @@
             <w:tcW w:w="4422" w:type="dxa"/>
           </w:tcPr>
           <w:p>
-            <w:r/>
-            <w:r>
-              <w:rPr>
-                <w:rFonts w:ascii="Arial" w:hAnsi="Arial"/>
-                <w:b/>
-                <w:sz w:val="20"/>
+            <w:pPr>
+              <w:spacing w:line="360" w:lineRule="auto"/>
+              <w:rPr>
+                <w:rFonts w:ascii="Arial" w:hAnsi="Arial" w:cs="Arial"/>
+                <w:b/>
+                <w:bCs/>
+              </w:rPr>
+            </w:pPr>
+            <w:r>
+              <w:rPr>
+                <w:rFonts w:ascii="Arial" w:hAnsi="Arial"/>
+                <w:b/>
+                <w:i w:val="0"/>
               </w:rPr>
               <w:t xml:space="preserve">Data do teste: </w:t>
             </w:r>
@@ -1229,7 +1255,7 @@
               <w:rPr>
                 <w:rFonts w:ascii="Arial" w:hAnsi="Arial"/>
                 <w:b w:val="0"/>
-                <w:sz w:val="20"/>
+                <w:i w:val="0"/>
               </w:rPr>
               <w:t>15/10/2026</w:t>
             </w:r>
@@ -1246,23 +1272,37 @@
             <w:gridSpan w:val="2"/>
           </w:tcPr>
           <w:p>
-            <w:r/>
-            <w:r>
-              <w:rPr>
-                <w:rFonts w:ascii="Arial" w:hAnsi="Arial"/>
-                <w:b/>
-                <w:sz w:val="20"/>
+            <w:pPr>
+              <w:spacing w:line="360" w:lineRule="auto"/>
+              <w:rPr>
+                <w:rFonts w:ascii="Arial" w:hAnsi="Arial" w:cs="Arial"/>
+                <w:b/>
+                <w:bCs/>
+              </w:rPr>
+            </w:pPr>
+            <w:r>
+              <w:rPr>
+                <w:rFonts w:ascii="Arial" w:hAnsi="Arial"/>
+                <w:b/>
+                <w:i w:val="0"/>
               </w:rPr>
               <w:t>O que testou e funcionou:</w:t>
-              <w:br/>
+            </w:r>
+            <w:r>
+              <w:rPr>
+                <w:rFonts w:ascii="Arial" w:hAnsi="Arial"/>
+                <w:b/>
+                <w:i w:val="0"/>
+              </w:rPr>
+              <w:t xml:space="preserve"> </w:t>
             </w:r>
             <w:r>
               <w:rPr>
                 <w:rFonts w:ascii="Arial" w:hAnsi="Arial"/>
                 <w:b w:val="0"/>
-                <w:sz w:val="20"/>
-              </w:rPr>
-              <w:t>Testou o módulo de Gestão de Kits e Linha de Manufatura (/items/kits), incluindo a configuração da receita do kit (BOM), adição de peças com marcação de componente exclusivo de painel (IsPainel), montagem de kits com baixa automática atômica de peças no almoxarifado e desmontagem reversível de kits com estorno integral de saldo para as prateleiras.</w:t>
+                <w:i w:val="0"/>
+              </w:rPr>
+              <w:t>Foi testado o módulo de Gestão de Kits e Linha de Manufatura, incluindo a criação de um novo kit, a configuração de sua composição (BOM) com marcação de peças exclusivas do painel elétrico e a operação de montagem de kits prontos. O sistema calculou corretamente a capacidade de montagem e realizou a baixa automática das peças no almoxarifado, além de permitir a desmontagem com estorno integral do saldo.</w:t>
             </w:r>
           </w:p>
         </w:tc>
@@ -1277,23 +1317,37 @@
             <w:gridSpan w:val="2"/>
           </w:tcPr>
           <w:p>
-            <w:r/>
-            <w:r>
-              <w:rPr>
-                <w:rFonts w:ascii="Arial" w:hAnsi="Arial"/>
-                <w:b/>
-                <w:sz w:val="20"/>
+            <w:pPr>
+              <w:spacing w:line="360" w:lineRule="auto"/>
+              <w:rPr>
+                <w:rFonts w:ascii="Arial" w:hAnsi="Arial" w:cs="Arial"/>
+                <w:b/>
+                <w:bCs/>
+              </w:rPr>
+            </w:pPr>
+            <w:r>
+              <w:rPr>
+                <w:rFonts w:ascii="Arial" w:hAnsi="Arial"/>
+                <w:b/>
+                <w:i w:val="0"/>
               </w:rPr>
               <w:t>O que testou e não funcionou – O que deve ser corrigido:</w:t>
-              <w:br/>
+            </w:r>
+            <w:r>
+              <w:rPr>
+                <w:rFonts w:ascii="Arial" w:hAnsi="Arial"/>
+                <w:b/>
+                <w:i w:val="0"/>
+              </w:rPr>
+              <w:t xml:space="preserve"> </w:t>
             </w:r>
             <w:r>
               <w:rPr>
                 <w:rFonts w:ascii="Arial" w:hAnsi="Arial"/>
                 <w:b w:val="0"/>
-                <w:sz w:val="20"/>
-              </w:rPr>
-              <w:t>Observou que nas tabelas com muitos registros (como o catálogo com mais de 170 peças e 52 kits) não era possível clicar no cabeçalho das colunas (ID, Nome, Saldo Atual, Capacidade) para ordenar em ordem crescente ou decrescente. Correção aplicada: implementados os componentes SortableTh.tsx e useTableSort.ts em todas as tabelas do sistema.</w:t>
+                <w:i w:val="0"/>
+              </w:rPr>
+              <w:t>As operações de montagem e desmontagem funcionaram corretamente, porém observou-se que nas tabelas com grande quantidade de registros (como o catálogo de peças e de kits) não era possível clicar no cabeçalho das colunas (ID, Nome, Saldo Atual, Capacidade) para ordenar os dados em ordem crescente ou decrescente, dificultando a localização rápida dos itens com menor saldo.</w:t>
             </w:r>
           </w:p>
         </w:tc>
@@ -1308,23 +1362,37 @@
             <w:gridSpan w:val="2"/>
           </w:tcPr>
           <w:p>
-            <w:r/>
-            <w:r>
-              <w:rPr>
-                <w:rFonts w:ascii="Arial" w:hAnsi="Arial"/>
-                <w:b/>
-                <w:sz w:val="20"/>
+            <w:pPr>
+              <w:spacing w:line="360" w:lineRule="auto"/>
+              <w:rPr>
+                <w:rFonts w:ascii="Arial" w:hAnsi="Arial" w:cs="Arial"/>
+                <w:b/>
+                <w:bCs/>
+              </w:rPr>
+            </w:pPr>
+            <w:r>
+              <w:rPr>
+                <w:rFonts w:ascii="Arial" w:hAnsi="Arial"/>
+                <w:b/>
+                <w:i w:val="0"/>
               </w:rPr>
               <w:t>Funcionalidade não testada (faltou ou não foi implementada):</w:t>
-              <w:br/>
+            </w:r>
+            <w:r>
+              <w:rPr>
+                <w:rFonts w:ascii="Arial" w:hAnsi="Arial"/>
+                <w:b/>
+                <w:i w:val="0"/>
+              </w:rPr>
+              <w:t xml:space="preserve"> </w:t>
             </w:r>
             <w:r>
               <w:rPr>
                 <w:rFonts w:ascii="Arial" w:hAnsi="Arial"/>
                 <w:b w:val="0"/>
-                <w:sz w:val="20"/>
-              </w:rPr>
-              <w:t>Não testou o módulo de Softwares &amp; CLPs (/softwares), pois concentrou sua bateria de testes nas rotinas de engenharia de produto e montagem física de kits.</w:t>
+                <w:i w:val="0"/>
+              </w:rPr>
+              <w:t>Não foi testado o módulo de controle de Softwares e versões de CLPs, pois os testes foram concentrados no fluxo de montagem física de kits.</w:t>
             </w:r>
           </w:p>
         </w:tc>
@@ -1342,7 +1410,7 @@
     </w:p>
     <w:tbl>
       <w:tblPr>
-        <w:tblStyle w:val="Tabelacomgrade"/>
+        <w:tblStyle w:val="TableGrid"/>
         <w:tblW w:w="9587" w:type="dxa"/>
         <w:tblLook w:val="04A0" w:firstRow="1" w:lastRow="0" w:firstColumn="1" w:lastColumn="0" w:noHBand="0" w:noVBand="1"/>
       </w:tblPr>
@@ -1359,12 +1427,19 @@
             <w:tcW w:w="5165" w:type="dxa"/>
           </w:tcPr>
           <w:p>
-            <w:r/>
-            <w:r>
-              <w:rPr>
-                <w:rFonts w:ascii="Arial" w:hAnsi="Arial"/>
-                <w:b/>
-                <w:sz w:val="20"/>
+            <w:pPr>
+              <w:spacing w:line="360" w:lineRule="auto"/>
+              <w:rPr>
+                <w:rFonts w:ascii="Arial" w:hAnsi="Arial" w:cs="Arial"/>
+                <w:b/>
+                <w:bCs/>
+              </w:rPr>
+            </w:pPr>
+            <w:r>
+              <w:rPr>
+                <w:rFonts w:ascii="Arial" w:hAnsi="Arial"/>
+                <w:b/>
+                <w:i w:val="0"/>
               </w:rPr>
               <w:t xml:space="preserve">Nome: </w:t>
             </w:r>
@@ -1372,7 +1447,7 @@
               <w:rPr>
                 <w:rFonts w:ascii="Arial" w:hAnsi="Arial"/>
                 <w:b w:val="0"/>
-                <w:sz w:val="20"/>
+                <w:i w:val="0"/>
               </w:rPr>
               <w:t>Luany Cardozo Ramos</w:t>
             </w:r>
@@ -1383,12 +1458,19 @@
             <w:tcW w:w="4422" w:type="dxa"/>
           </w:tcPr>
           <w:p>
-            <w:r/>
-            <w:r>
-              <w:rPr>
-                <w:rFonts w:ascii="Arial" w:hAnsi="Arial"/>
-                <w:b/>
-                <w:sz w:val="20"/>
+            <w:pPr>
+              <w:spacing w:line="360" w:lineRule="auto"/>
+              <w:rPr>
+                <w:rFonts w:ascii="Arial" w:hAnsi="Arial" w:cs="Arial"/>
+                <w:b/>
+                <w:bCs/>
+              </w:rPr>
+            </w:pPr>
+            <w:r>
+              <w:rPr>
+                <w:rFonts w:ascii="Arial" w:hAnsi="Arial"/>
+                <w:b/>
+                <w:i w:val="0"/>
               </w:rPr>
               <w:t xml:space="preserve">Data do teste: </w:t>
             </w:r>
@@ -1396,7 +1478,7 @@
               <w:rPr>
                 <w:rFonts w:ascii="Arial" w:hAnsi="Arial"/>
                 <w:b w:val="0"/>
-                <w:sz w:val="20"/>
+                <w:i w:val="0"/>
               </w:rPr>
               <w:t>16/10/2026</w:t>
             </w:r>
@@ -1413,23 +1495,37 @@
             <w:gridSpan w:val="2"/>
           </w:tcPr>
           <w:p>
-            <w:r/>
-            <w:r>
-              <w:rPr>
-                <w:rFonts w:ascii="Arial" w:hAnsi="Arial"/>
-                <w:b/>
-                <w:sz w:val="20"/>
+            <w:pPr>
+              <w:spacing w:line="360" w:lineRule="auto"/>
+              <w:rPr>
+                <w:rFonts w:ascii="Arial" w:hAnsi="Arial" w:cs="Arial"/>
+                <w:b/>
+                <w:bCs/>
+              </w:rPr>
+            </w:pPr>
+            <w:r>
+              <w:rPr>
+                <w:rFonts w:ascii="Arial" w:hAnsi="Arial"/>
+                <w:b/>
+                <w:i w:val="0"/>
               </w:rPr>
               <w:t>O que testou e funcionou:</w:t>
-              <w:br/>
+            </w:r>
+            <w:r>
+              <w:rPr>
+                <w:rFonts w:ascii="Arial" w:hAnsi="Arial"/>
+                <w:b/>
+                <w:i w:val="0"/>
+              </w:rPr>
+              <w:t xml:space="preserve"> </w:t>
             </w:r>
             <w:r>
               <w:rPr>
                 <w:rFonts w:ascii="Arial" w:hAnsi="Arial"/>
                 <w:b w:val="0"/>
-                <w:sz w:val="20"/>
-              </w:rPr>
-              <w:t>Testou o Simulador de Produção Multi-Kits, adicionando 4 modelos distintos de kits simultaneamente na fila de produção, alternando entre os modos de foco operacional ('Todos os Componentes', 'Exclusivo: Apenas Painéis' e 'Peças Gerais') e validando o cálculo automático de viabilidade, sobras e faltas de estoque sem afetar o saldo real.</w:t>
+                <w:i w:val="0"/>
+              </w:rPr>
+              <w:t>Foi utilizado o Simulador de Produção Multi-Kits adicionando diferentes modelos de kits simultaneamente na fila de produção. Foram testados os filtros de foco operacional (Todos os Componentes, Exclusivo Apenas Painéis e Peças Gerais) e a verificação de viabilidade. O balanço estimado apontou corretamente as sobras e as faltas de matéria-prima sem alterar o estoque real.</w:t>
             </w:r>
           </w:p>
         </w:tc>
@@ -1444,23 +1540,37 @@
             <w:gridSpan w:val="2"/>
           </w:tcPr>
           <w:p>
-            <w:r/>
-            <w:r>
-              <w:rPr>
-                <w:rFonts w:ascii="Arial" w:hAnsi="Arial"/>
-                <w:b/>
-                <w:sz w:val="20"/>
+            <w:pPr>
+              <w:spacing w:line="360" w:lineRule="auto"/>
+              <w:rPr>
+                <w:rFonts w:ascii="Arial" w:hAnsi="Arial" w:cs="Arial"/>
+                <w:b/>
+                <w:bCs/>
+              </w:rPr>
+            </w:pPr>
+            <w:r>
+              <w:rPr>
+                <w:rFonts w:ascii="Arial" w:hAnsi="Arial"/>
+                <w:b/>
+                <w:i w:val="0"/>
               </w:rPr>
               <w:t>O que testou e não funcionou – O que deve ser corrigido:</w:t>
-              <w:br/>
+            </w:r>
+            <w:r>
+              <w:rPr>
+                <w:rFonts w:ascii="Arial" w:hAnsi="Arial"/>
+                <w:b/>
+                <w:i w:val="0"/>
+              </w:rPr>
+              <w:t xml:space="preserve"> </w:t>
             </w:r>
             <w:r>
               <w:rPr>
                 <w:rFonts w:ascii="Arial" w:hAnsi="Arial"/>
                 <w:b w:val="0"/>
-                <w:sz w:val="20"/>
-              </w:rPr>
-              <w:t>Ao exportar o relatório CSV do simulador e abri-lo diretamente no Microsoft Excel em português, notou que alguns caracteres acentuados apareciam desconfigurados por falta de marcador UTF-8 BOM, e sugeriu agrupar a exportação por fornecedor para facilitar a cotação de compras. Correção aplicada: adicionado o prefixo UTF-8 BOM (\uFEFF) com delimitador ';' e agrupamento por fornecedor.</w:t>
+                <w:i w:val="0"/>
+              </w:rPr>
+              <w:t>Ao exportar o relatório CSV do simulador e abrir o arquivo diretamente no Microsoft Excel em português, alguns caracteres acentuados apareceram desconfigurados devido à ausência de marcador UTF-8 BOM. Além disso, sugeriu-se agrupar os itens do relatório por fornecedor para facilitar o envio de cotações pelo setor de compras.</w:t>
             </w:r>
           </w:p>
         </w:tc>
@@ -1475,23 +1585,37 @@
             <w:gridSpan w:val="2"/>
           </w:tcPr>
           <w:p>
-            <w:r/>
-            <w:r>
-              <w:rPr>
-                <w:rFonts w:ascii="Arial" w:hAnsi="Arial"/>
-                <w:b/>
-                <w:sz w:val="20"/>
+            <w:pPr>
+              <w:spacing w:line="360" w:lineRule="auto"/>
+              <w:rPr>
+                <w:rFonts w:ascii="Arial" w:hAnsi="Arial" w:cs="Arial"/>
+                <w:b/>
+                <w:bCs/>
+              </w:rPr>
+            </w:pPr>
+            <w:r>
+              <w:rPr>
+                <w:rFonts w:ascii="Arial" w:hAnsi="Arial"/>
+                <w:b/>
+                <w:i w:val="0"/>
               </w:rPr>
               <w:t>Funcionalidade não testada (faltou ou não foi implementada):</w:t>
-              <w:br/>
+            </w:r>
+            <w:r>
+              <w:rPr>
+                <w:rFonts w:ascii="Arial" w:hAnsi="Arial"/>
+                <w:b/>
+                <w:i w:val="0"/>
+              </w:rPr>
+              <w:t xml:space="preserve"> </w:t>
             </w:r>
             <w:r>
               <w:rPr>
                 <w:rFonts w:ascii="Arial" w:hAnsi="Arial"/>
                 <w:b w:val="0"/>
-                <w:sz w:val="20"/>
-              </w:rPr>
-              <w:t>Não testou a exclusão física de kits e fornecedores, pois realizou os testes de planejamento sobre os cadastros homologados já existentes na base.</w:t>
+                <w:i w:val="0"/>
+              </w:rPr>
+              <w:t>Não foram testadas a exclusão física de kits ou a alteração de permissões de acesso, utilizando-se os kits já homologados na base de dados.</w:t>
             </w:r>
           </w:p>
         </w:tc>
@@ -1539,7 +1663,7 @@
     </w:p>
     <w:tbl>
       <w:tblPr>
-        <w:tblStyle w:val="Tabelacomgrade"/>
+        <w:tblStyle w:val="TableGrid"/>
         <w:tblW w:w="9587" w:type="dxa"/>
         <w:tblLook w:val="04A0" w:firstRow="1" w:lastRow="0" w:firstColumn="1" w:lastColumn="0" w:noHBand="0" w:noVBand="1"/>
       </w:tblPr>
@@ -1556,12 +1680,19 @@
             <w:tcW w:w="5165" w:type="dxa"/>
           </w:tcPr>
           <w:p>
-            <w:r/>
-            <w:r>
-              <w:rPr>
-                <w:rFonts w:ascii="Arial" w:hAnsi="Arial"/>
-                <w:b/>
-                <w:sz w:val="20"/>
+            <w:pPr>
+              <w:spacing w:line="360" w:lineRule="auto"/>
+              <w:rPr>
+                <w:rFonts w:ascii="Arial" w:hAnsi="Arial" w:cs="Arial"/>
+                <w:b/>
+                <w:bCs/>
+              </w:rPr>
+            </w:pPr>
+            <w:r>
+              <w:rPr>
+                <w:rFonts w:ascii="Arial" w:hAnsi="Arial"/>
+                <w:b/>
+                <w:i w:val="0"/>
               </w:rPr>
               <w:t xml:space="preserve">Nome: </w:t>
             </w:r>
@@ -1569,7 +1700,7 @@
               <w:rPr>
                 <w:rFonts w:ascii="Arial" w:hAnsi="Arial"/>
                 <w:b w:val="0"/>
-                <w:sz w:val="20"/>
+                <w:i w:val="0"/>
               </w:rPr>
               <w:t>Maria Eduarda Martinelli Da Silva</w:t>
             </w:r>
@@ -1580,12 +1711,19 @@
             <w:tcW w:w="4422" w:type="dxa"/>
           </w:tcPr>
           <w:p>
-            <w:r/>
-            <w:r>
-              <w:rPr>
-                <w:rFonts w:ascii="Arial" w:hAnsi="Arial"/>
-                <w:b/>
-                <w:sz w:val="20"/>
+            <w:pPr>
+              <w:spacing w:line="360" w:lineRule="auto"/>
+              <w:rPr>
+                <w:rFonts w:ascii="Arial" w:hAnsi="Arial" w:cs="Arial"/>
+                <w:b/>
+                <w:bCs/>
+              </w:rPr>
+            </w:pPr>
+            <w:r>
+              <w:rPr>
+                <w:rFonts w:ascii="Arial" w:hAnsi="Arial"/>
+                <w:b/>
+                <w:i w:val="0"/>
               </w:rPr>
               <w:t xml:space="preserve">Data do teste: </w:t>
             </w:r>
@@ -1593,7 +1731,7 @@
               <w:rPr>
                 <w:rFonts w:ascii="Arial" w:hAnsi="Arial"/>
                 <w:b w:val="0"/>
-                <w:sz w:val="20"/>
+                <w:i w:val="0"/>
               </w:rPr>
               <w:t>18/10/2026</w:t>
             </w:r>
@@ -1610,23 +1748,37 @@
             <w:gridSpan w:val="2"/>
           </w:tcPr>
           <w:p>
-            <w:r/>
-            <w:r>
-              <w:rPr>
-                <w:rFonts w:ascii="Arial" w:hAnsi="Arial"/>
-                <w:b/>
-                <w:sz w:val="20"/>
+            <w:pPr>
+              <w:spacing w:line="360" w:lineRule="auto"/>
+              <w:rPr>
+                <w:rFonts w:ascii="Arial" w:hAnsi="Arial" w:cs="Arial"/>
+                <w:b/>
+                <w:bCs/>
+              </w:rPr>
+            </w:pPr>
+            <w:r>
+              <w:rPr>
+                <w:rFonts w:ascii="Arial" w:hAnsi="Arial"/>
+                <w:b/>
+                <w:i w:val="0"/>
               </w:rPr>
               <w:t>O que testou e funcionou:</w:t>
-              <w:br/>
+            </w:r>
+            <w:r>
+              <w:rPr>
+                <w:rFonts w:ascii="Arial" w:hAnsi="Arial"/>
+                <w:b/>
+                <w:i w:val="0"/>
+              </w:rPr>
+              <w:t xml:space="preserve"> </w:t>
             </w:r>
             <w:r>
               <w:rPr>
                 <w:rFonts w:ascii="Arial" w:hAnsi="Arial"/>
                 <w:b w:val="0"/>
-                <w:sz w:val="20"/>
-              </w:rPr>
-              <w:t>Testou o módulo de Softwares &amp; CLPs (/softwares), realizando o cadastro de versões de firmware associadas a clientes e kits, filtrando por tipo de dispositivo (CLP, IHM, Inversor) e status operacional, além de validar a alternância entre Modo Claro e Modo Escuro e a consulta ao Histórico de Auditoria de Movimentações.</w:t>
+                <w:i w:val="0"/>
+              </w:rPr>
+              <w:t>Foram realizados o cadastro e a filtragem de versões de firmware no módulo de Softwares e CLPs, vinculando cada instalação ao respectivo cliente, kit e tipo de dispositivo (CLP, IHM e Inversor). Também foram testadas a alternância entre Modo Claro e Modo Escuro e a consulta ao Histórico de Auditoria de Movimentações com saldos anteriores e posteriores.</w:t>
             </w:r>
           </w:p>
         </w:tc>
@@ -1641,23 +1793,37 @@
             <w:gridSpan w:val="2"/>
           </w:tcPr>
           <w:p>
-            <w:r/>
-            <w:r>
-              <w:rPr>
-                <w:rFonts w:ascii="Arial" w:hAnsi="Arial"/>
-                <w:b/>
-                <w:sz w:val="20"/>
+            <w:pPr>
+              <w:spacing w:line="360" w:lineRule="auto"/>
+              <w:rPr>
+                <w:rFonts w:ascii="Arial" w:hAnsi="Arial" w:cs="Arial"/>
+                <w:b/>
+                <w:bCs/>
+              </w:rPr>
+            </w:pPr>
+            <w:r>
+              <w:rPr>
+                <w:rFonts w:ascii="Arial" w:hAnsi="Arial"/>
+                <w:b/>
+                <w:i w:val="0"/>
               </w:rPr>
               <w:t>O que testou e não funcionou – O que deve ser corrigido:</w:t>
-              <w:br/>
+            </w:r>
+            <w:r>
+              <w:rPr>
+                <w:rFonts w:ascii="Arial" w:hAnsi="Arial"/>
+                <w:b/>
+                <w:i w:val="0"/>
+              </w:rPr>
+              <w:t xml:space="preserve"> </w:t>
             </w:r>
             <w:r>
               <w:rPr>
                 <w:rFonts w:ascii="Arial" w:hAnsi="Arial"/>
                 <w:b w:val="0"/>
-                <w:sz w:val="20"/>
-              </w:rPr>
-              <w:t>Identificou que quando uma peça, kit ou fornecedor já possuía histórico de movimentações ou vínculo na composição, tentar excluí-lo gerava bloqueio de integridade, sendo necessário um botão prático para apenas inativar o item obsoleto sem apagar o histórico passado. Correção aplicada: adicionado o atributo 'Ativo' e o botão de Alternar Status (Ativar/Inativar) em Fornecedores, Itens e Kits.</w:t>
+                <w:i w:val="0"/>
+              </w:rPr>
+              <w:t>Durante o teste de manutenção de cadastros, verificou-se que o sistema bloqueia a exclusão de peças, kits ou fornecedores que já possuem histórico de movimentação para preservar a auditoria. Sugere-se adicionar um botão para apenas inativar cadastros obsoletos, ocultando-os das listagens operacionais sem apagar o histórico passado.</w:t>
             </w:r>
           </w:p>
         </w:tc>
@@ -1672,23 +1838,37 @@
             <w:gridSpan w:val="2"/>
           </w:tcPr>
           <w:p>
-            <w:r/>
-            <w:r>
-              <w:rPr>
-                <w:rFonts w:ascii="Arial" w:hAnsi="Arial"/>
-                <w:b/>
-                <w:sz w:val="20"/>
+            <w:pPr>
+              <w:spacing w:line="360" w:lineRule="auto"/>
+              <w:rPr>
+                <w:rFonts w:ascii="Arial" w:hAnsi="Arial" w:cs="Arial"/>
+                <w:b/>
+                <w:bCs/>
+              </w:rPr>
+            </w:pPr>
+            <w:r>
+              <w:rPr>
+                <w:rFonts w:ascii="Arial" w:hAnsi="Arial"/>
+                <w:b/>
+                <w:i w:val="0"/>
               </w:rPr>
               <w:t>Funcionalidade não testada (faltou ou não foi implementada):</w:t>
-              <w:br/>
+            </w:r>
+            <w:r>
+              <w:rPr>
+                <w:rFonts w:ascii="Arial" w:hAnsi="Arial"/>
+                <w:b/>
+                <w:i w:val="0"/>
+              </w:rPr>
+              <w:t xml:space="preserve"> </w:t>
             </w:r>
             <w:r>
               <w:rPr>
                 <w:rFonts w:ascii="Arial" w:hAnsi="Arial"/>
                 <w:b w:val="0"/>
-                <w:sz w:val="20"/>
-              </w:rPr>
-              <w:t>Não testou o estorno de kits prontos (Desmontar Kit), pois seus testes focaram na rastreabilidade de softwares instalados e catálogo de peças.</w:t>
+                <w:i w:val="0"/>
+              </w:rPr>
+              <w:t>Não foi testada a operação de desmontagem de kits prontos, mantendo o foco na rastreabilidade de softwares e auditoria.</w:t>
             </w:r>
           </w:p>
         </w:tc>
@@ -1706,7 +1886,7 @@
     </w:p>
     <w:tbl>
       <w:tblPr>
-        <w:tblStyle w:val="Tabelacomgrade"/>
+        <w:tblStyle w:val="TableGrid"/>
         <w:tblW w:w="9587" w:type="dxa"/>
         <w:tblLook w:val="04A0" w:firstRow="1" w:lastRow="0" w:firstColumn="1" w:lastColumn="0" w:noHBand="0" w:noVBand="1"/>
       </w:tblPr>
@@ -1723,12 +1903,19 @@
             <w:tcW w:w="5165" w:type="dxa"/>
           </w:tcPr>
           <w:p>
-            <w:r/>
-            <w:r>
-              <w:rPr>
-                <w:rFonts w:ascii="Arial" w:hAnsi="Arial"/>
-                <w:b/>
-                <w:sz w:val="20"/>
+            <w:pPr>
+              <w:spacing w:line="360" w:lineRule="auto"/>
+              <w:rPr>
+                <w:rFonts w:ascii="Arial" w:hAnsi="Arial" w:cs="Arial"/>
+                <w:b/>
+                <w:bCs/>
+              </w:rPr>
+            </w:pPr>
+            <w:r>
+              <w:rPr>
+                <w:rFonts w:ascii="Arial" w:hAnsi="Arial"/>
+                <w:b/>
+                <w:i w:val="0"/>
               </w:rPr>
               <w:t xml:space="preserve">Nome: </w:t>
             </w:r>
@@ -1736,7 +1923,7 @@
               <w:rPr>
                 <w:rFonts w:ascii="Arial" w:hAnsi="Arial"/>
                 <w:b w:val="0"/>
-                <w:sz w:val="20"/>
+                <w:i w:val="0"/>
               </w:rPr>
               <w:t>Nicole Bressan Fontanelli</w:t>
             </w:r>
@@ -1747,12 +1934,19 @@
             <w:tcW w:w="4422" w:type="dxa"/>
           </w:tcPr>
           <w:p>
-            <w:r/>
-            <w:r>
-              <w:rPr>
-                <w:rFonts w:ascii="Arial" w:hAnsi="Arial"/>
-                <w:b/>
-                <w:sz w:val="20"/>
+            <w:pPr>
+              <w:spacing w:line="360" w:lineRule="auto"/>
+              <w:rPr>
+                <w:rFonts w:ascii="Arial" w:hAnsi="Arial" w:cs="Arial"/>
+                <w:b/>
+                <w:bCs/>
+              </w:rPr>
+            </w:pPr>
+            <w:r>
+              <w:rPr>
+                <w:rFonts w:ascii="Arial" w:hAnsi="Arial"/>
+                <w:b/>
+                <w:i w:val="0"/>
               </w:rPr>
               <w:t xml:space="preserve">Data do teste: </w:t>
             </w:r>
@@ -1760,7 +1954,7 @@
               <w:rPr>
                 <w:rFonts w:ascii="Arial" w:hAnsi="Arial"/>
                 <w:b w:val="0"/>
-                <w:sz w:val="20"/>
+                <w:i w:val="0"/>
               </w:rPr>
               <w:t>24/10/2026</w:t>
             </w:r>
@@ -1777,23 +1971,37 @@
             <w:gridSpan w:val="2"/>
           </w:tcPr>
           <w:p>
-            <w:r/>
-            <w:r>
-              <w:rPr>
-                <w:rFonts w:ascii="Arial" w:hAnsi="Arial"/>
-                <w:b/>
-                <w:sz w:val="20"/>
+            <w:pPr>
+              <w:spacing w:line="360" w:lineRule="auto"/>
+              <w:rPr>
+                <w:rFonts w:ascii="Arial" w:hAnsi="Arial" w:cs="Arial"/>
+                <w:b/>
+                <w:bCs/>
+              </w:rPr>
+            </w:pPr>
+            <w:r>
+              <w:rPr>
+                <w:rFonts w:ascii="Arial" w:hAnsi="Arial"/>
+                <w:b/>
+                <w:i w:val="0"/>
               </w:rPr>
               <w:t>O que testou e funcionou:</w:t>
-              <w:br/>
+            </w:r>
+            <w:r>
+              <w:rPr>
+                <w:rFonts w:ascii="Arial" w:hAnsi="Arial"/>
+                <w:b/>
+                <w:i w:val="0"/>
+              </w:rPr>
+              <w:t xml:space="preserve"> </w:t>
             </w:r>
             <w:r>
               <w:rPr>
                 <w:rFonts w:ascii="Arial" w:hAnsi="Arial"/>
                 <w:b w:val="0"/>
-                <w:sz w:val="20"/>
-              </w:rPr>
-              <w:t>Testou a aplicação publicada em nuvem (Front-end na Vercel, API em container Docker no Render e banco MySQL na Aiven), validando a proteção de rotas autenticadas, o controle de usuários pelo perfil Administrador (/users) com trava contra autoexclusão e a estabilidade das transações em ambiente web público.</w:t>
+                <w:i w:val="0"/>
+              </w:rPr>
+              <w:t>Foi testado o acesso à aplicação publicada em nuvem, validando a proteção de rotas autenticadas, o controle de usuários pelo perfil Administrador (incluindo a trava de segurança que impede o administrador logado de excluir a própria conta) e a responsividade das telas em diferentes resoluções.</w:t>
             </w:r>
           </w:p>
         </w:tc>
@@ -1808,23 +2016,37 @@
             <w:gridSpan w:val="2"/>
           </w:tcPr>
           <w:p>
-            <w:r/>
-            <w:r>
-              <w:rPr>
-                <w:rFonts w:ascii="Arial" w:hAnsi="Arial"/>
-                <w:b/>
-                <w:sz w:val="20"/>
+            <w:pPr>
+              <w:spacing w:line="360" w:lineRule="auto"/>
+              <w:rPr>
+                <w:rFonts w:ascii="Arial" w:hAnsi="Arial" w:cs="Arial"/>
+                <w:b/>
+                <w:bCs/>
+              </w:rPr>
+            </w:pPr>
+            <w:r>
+              <w:rPr>
+                <w:rFonts w:ascii="Arial" w:hAnsi="Arial"/>
+                <w:b/>
+                <w:i w:val="0"/>
               </w:rPr>
               <w:t>O que testou e não funcionou – O que deve ser corrigido:</w:t>
-              <w:br/>
+            </w:r>
+            <w:r>
+              <w:rPr>
+                <w:rFonts w:ascii="Arial" w:hAnsi="Arial"/>
+                <w:b/>
+                <w:i w:val="0"/>
+              </w:rPr>
+              <w:t xml:space="preserve"> </w:t>
             </w:r>
             <w:r>
               <w:rPr>
                 <w:rFonts w:ascii="Arial" w:hAnsi="Arial"/>
                 <w:b w:val="0"/>
-                <w:sz w:val="20"/>
-              </w:rPr>
-              <w:t>No primeiro teste após a migração do banco de dados do Windows para o servidor Linux em nuvem (Aiven), a rota de login (/api/Auth/Login) retornou erro 500 porque o MySQL no Linux diferencia maiúsculas e minúsculas nos nomes das tabelas ('FROM Usuario' vs. tabela 'usuario'), além de o Swagger estar oculto em produção. Correção aplicada: padronizadas todas as queries SQL dos 7 repositórios para nomes de tabelas em minúsculas e liberado o Swagger em Produção no Program.cs.</w:t>
+                <w:i w:val="0"/>
+              </w:rPr>
+              <w:t>Na primeira tentativa de autenticação após a publicação da API e do banco de dados MySQL em servidor Linux na nuvem, o login retornou erro interno (HTTP 500) porque o MySQL em ambiente Linux diferencia letras maiúsculas e minúsculas nos nomes das tabelas, além de a documentação do Swagger não estar visível em produção para inspeção das rotas.</w:t>
             </w:r>
           </w:p>
         </w:tc>
@@ -1839,23 +2061,37 @@
             <w:gridSpan w:val="2"/>
           </w:tcPr>
           <w:p>
-            <w:r/>
-            <w:r>
-              <w:rPr>
-                <w:rFonts w:ascii="Arial" w:hAnsi="Arial"/>
-                <w:b/>
-                <w:sz w:val="20"/>
+            <w:pPr>
+              <w:spacing w:line="360" w:lineRule="auto"/>
+              <w:rPr>
+                <w:rFonts w:ascii="Arial" w:hAnsi="Arial" w:cs="Arial"/>
+                <w:b/>
+                <w:bCs/>
+              </w:rPr>
+            </w:pPr>
+            <w:r>
+              <w:rPr>
+                <w:rFonts w:ascii="Arial" w:hAnsi="Arial"/>
+                <w:b/>
+                <w:i w:val="0"/>
               </w:rPr>
               <w:t>Funcionalidade não testada (faltou ou não foi implementada):</w:t>
-              <w:br/>
+            </w:r>
+            <w:r>
+              <w:rPr>
+                <w:rFonts w:ascii="Arial" w:hAnsi="Arial"/>
+                <w:b/>
+                <w:i w:val="0"/>
+              </w:rPr>
+              <w:t xml:space="preserve"> </w:t>
             </w:r>
             <w:r>
               <w:rPr>
                 <w:rFonts w:ascii="Arial" w:hAnsi="Arial"/>
                 <w:b w:val="0"/>
-                <w:sz w:val="20"/>
-              </w:rPr>
-              <w:t>Recuperação automática de senha por envio de e-mail (SMTP), funcionalidade que não faz parte do escopo do projeto, visto que o gerenciamento de senhas é feito pelo Administrador.</w:t>
+                <w:i w:val="0"/>
+              </w:rPr>
+              <w:t>Não foram testados procedimentos de recuperação automática de senha por envio de e-mail, pois essa funcionalidade não faz parte do escopo atual do sistema, sendo a redefinição realizada pelo Administrador.</w:t>
             </w:r>
           </w:p>
         </w:tc>
@@ -1923,104 +2159,265 @@
           <w:rFonts w:ascii="Arial" w:hAnsi="Arial" w:cs="Arial"/>
         </w:rPr>
       </w:pPr>
-      <w:r>
-        <w:rPr>
-          <w:rFonts w:ascii="Arial" w:hAnsi="Arial"/>
-          <w:b/>
-          <w:sz w:val="20"/>
-        </w:rPr>
-        <w:t>1. Metodologia de Verificação e Validação (Modelo V):</w:t>
-        <w:br/>
-      </w:r>
+    </w:p>
+    <w:p>
+      <w:pPr>
+        <w:spacing w:after="0" w:line="360" w:lineRule="auto"/>
+        <w:rPr>
+          <w:rFonts w:ascii="Arial" w:hAnsi="Arial" w:cs="Arial"/>
+        </w:rPr>
+      </w:pPr>
       <w:r>
         <w:rPr>
           <w:rFonts w:ascii="Arial" w:hAnsi="Arial"/>
           <w:b w:val="0"/>
-          <w:sz w:val="20"/>
-        </w:rPr>
-        <w:t>O controle de qualidade do ShelfApp ERP foi conduzido seguindo o Modelo V apresentado na disciplina, combinando Verificação (análise estática com TypeScript 5 strict mode, compilação C# .NET 9 com zero avisos/erros e inspeção de conformidade de requisitos) e Validação (testes unitários de regras de negócio, testes de integração transacional Dapper + MySQL, testes de sistema end-to-end em nuvem e testes de aceitação com os 5 avaliadores).</w:t>
-      </w:r>
-    </w:p>
-    <w:p>
-      <w:pPr>
-        <w:spacing w:after="0" w:line="360" w:lineRule="auto"/>
-        <w:rPr>
-          <w:rFonts w:ascii="Arial" w:hAnsi="Arial" w:cs="Arial"/>
-          <w:b/>
-          <w:bCs/>
+          <w:i w:val="0"/>
+        </w:rPr>
+        <w:t>Foram analisados cinco cenários de teste, contemplando as principais funcionalidades do sistema. Os resultados permitiram identificar oportunidades de melhoria na usabilidade, na rastreabilidade operacional e na estabilidade do ambiente em nuvem.</w:t>
+      </w:r>
+    </w:p>
+    <w:p>
+      <w:pPr>
+        <w:numPr>
+          <w:ilvl w:val="0"/>
+          <w:numId w:val="2"/>
+        </w:numPr>
+        <w:spacing w:after="0" w:line="360" w:lineRule="auto"/>
+        <w:rPr>
+          <w:rFonts w:ascii="Arial" w:hAnsi="Arial" w:cs="Arial"/>
         </w:rPr>
       </w:pPr>
       <w:r>
         <w:rPr>
           <w:rFonts w:ascii="Arial" w:hAnsi="Arial"/>
           <w:b/>
-          <w:sz w:val="20"/>
-        </w:rPr>
-        <w:t>2. Registro de Anomalias Identificadas e Correções Implementadas (Ciclo Kaizen):</w:t>
-        <w:br/>
+          <w:i w:val="0"/>
+        </w:rPr>
+        <w:t>Teste 1 – Almoxarifado e Recebimento:</w:t>
       </w:r>
       <w:r>
         <w:rPr>
           <w:rFonts w:ascii="Arial" w:hAnsi="Arial"/>
           <w:b w:val="0"/>
-          <w:sz w:val="20"/>
-        </w:rPr>
-        <w:t>• [Correção #01 - Rastreabilidade Fiscal e Importação XML]: A partir do apontamento do Avaliador 1, foi adicionada a coluna 'notaFiscal' na tabela 'movimentacao_estoque' e construído o componente 'ImportarXmlModal.tsx' integrado ao endpoint 'POST /api/Estoque/ImportarLote'. O sistema agora lê arquivos XML de NF-e, pré-visualiza os produtos e executa o cadastro e entrada de saldo em lote dentro de uma transação SQL (BeginTransaction/Commit).</w:t>
-        <w:br/>
-        <w:t>• [Correção #02 - Ordenação Dinâmica em Tabelas]: Atendendo ao Avaliador 2, foram criados o hook 'useTableSort.ts' e o componente 'SortableTh.tsx', permitindo ordenação crescente/decrescente em todas as colunas do Dashboard, Estoque, Kits, Auditoria e Simulador.</w:t>
-      </w:r>
-    </w:p>
-    <w:p>
-      <w:pPr>
-        <w:spacing w:after="0" w:line="360" w:lineRule="auto"/>
-        <w:rPr>
-          <w:rFonts w:ascii="Arial" w:hAnsi="Arial" w:cs="Arial"/>
-          <w:b/>
-          <w:bCs/>
-        </w:rPr>
-      </w:pPr>
+          <w:i w:val="0"/>
+        </w:rPr>
+        <w:t xml:space="preserve"> ausência de campo dedicado para Nota Fiscal e necessidade de importação em lote. </w:t>
+      </w:r>
+      <w:r>
+        <w:rPr>
+          <w:rFonts w:ascii="Arial" w:hAnsi="Arial"/>
+          <w:b/>
+          <w:i w:val="0"/>
+        </w:rPr>
+        <w:t>Correção:</w:t>
+      </w:r>
       <w:r>
         <w:rPr>
           <w:rFonts w:ascii="Arial" w:hAnsi="Arial"/>
           <w:b w:val="0"/>
-          <w:sz w:val="20"/>
-        </w:rPr>
-        <w:t>• [Correção #03 - Codificação UTF-8 BOM e Agrupamento por Fornecedor em CSV]: Atendendo ao Avaliador 3, todas as rotinas de exportação de planilhas (.csv) receberam o cabeçalho UTF-8 BOM ('\uFEFF') e separador ponto e vírgula (';'), eliminando falhas de acentuação no Microsoft Excel e LibreOffice Calc.</w:t>
-        <w:br/>
-        <w:t>• [Correção #04 - Inativação Lógica Segura (Toggle Status)]: Atendendo ao Avaliador 4, foi implementado o botão de Ativar/Inativar ('PATCH /toggle-status') para Fornecedores, Peças e Kits, preservando a integridade referencial dos históricos de auditoria.</w:t>
-        <w:br/>
-        <w:t>• [Correção #05 - Compatibilidade Case-Sensitive MySQL Linux (Aiven Cloud) e Swagger]: Atendendo ao Avaliador 5 durante o deploy em produção, todas as instruções SQL dos 7 repositórios da ShelfApi foram padronizadas para nomes de tabelas em minúsculas ('usuario', 'item', 'fornecedor', 'kit', 'kititem', 'software'), solucionando definitivamente o erro 500 no Linux, além de habilitar o Swagger UI em produção e normalizar URIs 'mysql://' no MySqlConnectionFactory.</w:t>
-      </w:r>
-    </w:p>
-    <w:p>
-      <w:pPr>
-        <w:spacing w:after="0" w:line="360" w:lineRule="auto"/>
-        <w:rPr>
-          <w:rFonts w:ascii="Arial" w:hAnsi="Arial" w:cs="Arial"/>
-          <w:b/>
-          <w:bCs/>
+          <w:i w:val="0"/>
+        </w:rPr>
+        <w:t xml:space="preserve"> implementada a coluna notaFiscal no banco de dados e criado o modal de importação automatizada de NF-e via arquivo XML.</w:t>
+      </w:r>
+    </w:p>
+    <w:p>
+      <w:pPr>
+        <w:numPr>
+          <w:ilvl w:val="0"/>
+          <w:numId w:val="2"/>
+        </w:numPr>
+        <w:spacing w:after="0" w:line="360" w:lineRule="auto"/>
+        <w:rPr>
+          <w:rFonts w:ascii="Arial" w:hAnsi="Arial" w:cs="Arial"/>
         </w:rPr>
       </w:pPr>
       <w:r>
         <w:rPr>
           <w:rFonts w:ascii="Arial" w:hAnsi="Arial"/>
           <w:b/>
-          <w:sz w:val="20"/>
-        </w:rPr>
-        <w:t>3. Evidências de Qualidade e Bateria de Testes Aprovada:</w:t>
-        <w:br/>
+          <w:i w:val="0"/>
+        </w:rPr>
+        <w:t>Teste 2 – Gestão de Kits e Tabelas:</w:t>
       </w:r>
       <w:r>
         <w:rPr>
           <w:rFonts w:ascii="Arial" w:hAnsi="Arial"/>
           <w:b w:val="0"/>
-          <w:sz w:val="20"/>
-        </w:rPr>
-        <w:t>• Testes Unitários e de Regras: Cálculo de MontagensPossiveis por item gargalo (Aprovado); Bloqueio de saída com saldo negativo em estoque e kits (Aprovado); Extração de tags XML &lt;nfeProc&gt; (Aprovado).</w:t>
-        <w:br/>
-        <w:t>• Testes de Integração ACID: Rollback automático caso falte 1 único componente durante a montagem de kit (Aprovado); Baixa atômica de múltiplos componentes e registro simultâneo em movimentacao_estoque e movimentacao_kit (Aprovado).</w:t>
-        <w:br/>
-        <w:t>• Evidências Abertas em Produção: Código-fonte, commits de correção, scripts SQL e caderno de testes disponíveis publicamente em https://github.com/KonoDoardoDa/ShelfApp/tree/main/docs e API auditável ao vivo em https://shelfapi.onrender.com/swagger.</w:t>
+          <w:i w:val="0"/>
+        </w:rPr>
+        <w:t xml:space="preserve"> ausência de ordenação por colunas nas listagens de peças e kits. </w:t>
+      </w:r>
+      <w:r>
+        <w:rPr>
+          <w:rFonts w:ascii="Arial" w:hAnsi="Arial"/>
+          <w:b/>
+          <w:i w:val="0"/>
+        </w:rPr>
+        <w:t>Correção:</w:t>
+      </w:r>
+      <w:r>
+        <w:rPr>
+          <w:rFonts w:ascii="Arial" w:hAnsi="Arial"/>
+          <w:b w:val="0"/>
+          <w:i w:val="0"/>
+        </w:rPr>
+        <w:t xml:space="preserve"> implementada a ordenação dinâmica crescente e decrescente nos cabeçalhos das tabelas utilizando SortableTh e useTableSort.</w:t>
+      </w:r>
+    </w:p>
+    <w:p>
+      <w:pPr>
+        <w:numPr>
+          <w:ilvl w:val="0"/>
+          <w:numId w:val="2"/>
+        </w:numPr>
+        <w:spacing w:after="0" w:line="360" w:lineRule="auto"/>
+        <w:rPr>
+          <w:rFonts w:ascii="Arial" w:hAnsi="Arial" w:cs="Arial"/>
+        </w:rPr>
+      </w:pPr>
+      <w:r>
+        <w:rPr>
+          <w:rFonts w:ascii="Arial" w:hAnsi="Arial"/>
+          <w:b/>
+          <w:i w:val="0"/>
+        </w:rPr>
+        <w:t>Teste 3 – Simulador de Produção:</w:t>
+      </w:r>
+      <w:r>
+        <w:rPr>
+          <w:rFonts w:ascii="Arial" w:hAnsi="Arial"/>
+          <w:b w:val="0"/>
+          <w:i w:val="0"/>
+        </w:rPr>
+        <w:t xml:space="preserve"> falha de acentuação ao abrir relatórios CSV no Excel e necessidade de agrupamento para compras. </w:t>
+      </w:r>
+      <w:r>
+        <w:rPr>
+          <w:rFonts w:ascii="Arial" w:hAnsi="Arial"/>
+          <w:b/>
+          <w:i w:val="0"/>
+        </w:rPr>
+        <w:t>Correção:</w:t>
+      </w:r>
+      <w:r>
+        <w:rPr>
+          <w:rFonts w:ascii="Arial" w:hAnsi="Arial"/>
+          <w:b w:val="0"/>
+          <w:i w:val="0"/>
+        </w:rPr>
+        <w:t xml:space="preserve"> implementada a exportação com prefixo UTF-8 BOM (\uFEFF), delimitador ponto e vírgula e agrupamento por fornecedor.</w:t>
+      </w:r>
+    </w:p>
+    <w:p>
+      <w:pPr>
+        <w:numPr>
+          <w:ilvl w:val="0"/>
+          <w:numId w:val="2"/>
+        </w:numPr>
+        <w:spacing w:after="0" w:line="360" w:lineRule="auto"/>
+        <w:rPr>
+          <w:rFonts w:ascii="Arial" w:hAnsi="Arial" w:cs="Arial"/>
+        </w:rPr>
+      </w:pPr>
+      <w:r>
+        <w:rPr>
+          <w:rFonts w:ascii="Arial" w:hAnsi="Arial"/>
+          <w:b/>
+          <w:i w:val="0"/>
+        </w:rPr>
+        <w:t>Teste 4 – Manutenção de Cadastros:</w:t>
+      </w:r>
+      <w:r>
+        <w:rPr>
+          <w:rFonts w:ascii="Arial" w:hAnsi="Arial"/>
+          <w:b w:val="0"/>
+          <w:i w:val="0"/>
+        </w:rPr>
+        <w:t xml:space="preserve"> impossibilidade de ocultar itens obsoletos que já possuíam histórico de movimentação. </w:t>
+      </w:r>
+      <w:r>
+        <w:rPr>
+          <w:rFonts w:ascii="Arial" w:hAnsi="Arial"/>
+          <w:b/>
+          <w:i w:val="0"/>
+        </w:rPr>
+        <w:t>Correção:</w:t>
+      </w:r>
+      <w:r>
+        <w:rPr>
+          <w:rFonts w:ascii="Arial" w:hAnsi="Arial"/>
+          <w:b w:val="0"/>
+          <w:i w:val="0"/>
+        </w:rPr>
+        <w:t xml:space="preserve"> implementado o botão de ativação e inativação lógica (Ativo/Inativo) para fornecedores, peças e kits, preservando o histórico de auditoria.</w:t>
+      </w:r>
+    </w:p>
+    <w:p>
+      <w:pPr>
+        <w:numPr>
+          <w:ilvl w:val="0"/>
+          <w:numId w:val="2"/>
+        </w:numPr>
+        <w:spacing w:after="0" w:line="360" w:lineRule="auto"/>
+        <w:rPr>
+          <w:rFonts w:ascii="Arial" w:hAnsi="Arial" w:cs="Arial"/>
+        </w:rPr>
+      </w:pPr>
+      <w:r>
+        <w:rPr>
+          <w:rFonts w:ascii="Arial" w:hAnsi="Arial"/>
+          <w:b/>
+          <w:i w:val="0"/>
+        </w:rPr>
+        <w:t>Teste 5 – Hospedagem em Nuvem e API:</w:t>
+      </w:r>
+      <w:r>
+        <w:rPr>
+          <w:rFonts w:ascii="Arial" w:hAnsi="Arial"/>
+          <w:b w:val="0"/>
+          <w:i w:val="0"/>
+        </w:rPr>
+        <w:t xml:space="preserve"> falha na consulta SQL após migração para servidor Linux (case-sensitivity) e ausência do Swagger em produção. </w:t>
+      </w:r>
+      <w:r>
+        <w:rPr>
+          <w:rFonts w:ascii="Arial" w:hAnsi="Arial"/>
+          <w:b/>
+          <w:i w:val="0"/>
+        </w:rPr>
+        <w:t>Correção:</w:t>
+      </w:r>
+      <w:r>
+        <w:rPr>
+          <w:rFonts w:ascii="Arial" w:hAnsi="Arial"/>
+          <w:b w:val="0"/>
+          <w:i w:val="0"/>
+        </w:rPr>
+        <w:t xml:space="preserve"> padronizados os nomes das tabelas em letras minúsculas nos repositórios da API e habilitado o Swagger UI em ambiente de produção.</w:t>
+      </w:r>
+    </w:p>
+    <w:p>
+      <w:pPr>
+        <w:spacing w:after="0" w:line="360" w:lineRule="auto"/>
+        <w:rPr>
+          <w:rFonts w:ascii="Arial" w:hAnsi="Arial" w:cs="Arial"/>
+        </w:rPr>
+      </w:pPr>
+    </w:p>
+    <w:p>
+      <w:pPr>
+        <w:spacing w:after="0" w:line="360" w:lineRule="auto"/>
+        <w:rPr>
+          <w:rFonts w:ascii="Arial" w:hAnsi="Arial" w:cs="Arial"/>
+        </w:rPr>
+      </w:pPr>
+      <w:r>
+        <w:rPr>
+          <w:rFonts w:ascii="Arial" w:hAnsi="Arial"/>
+          <w:b w:val="0"/>
+          <w:i w:val="0"/>
+        </w:rPr>
+        <w:t>As alterações foram registradas em commits individuais no repositório GitHub, permitindo a rastreabilidade das correções. As evidências de funcionamento e validação das melhorias estão disponíveis nos vídeos demonstrativos apresentados neste relatório.</w:t>
       </w:r>
     </w:p>
     <w:p>
@@ -2094,13 +2491,13 @@
     </w:p>
     <w:tbl>
       <w:tblPr>
-        <w:tblStyle w:val="Tabelacomgrade"/>
+        <w:tblStyle w:val="TableGrid"/>
         <w:tblW w:w="9634" w:type="dxa"/>
         <w:tblLook w:val="04A0" w:firstRow="1" w:lastRow="0" w:firstColumn="1" w:lastColumn="0" w:noHBand="0" w:noVBand="1"/>
       </w:tblPr>
       <w:tblGrid>
-        <w:gridCol w:w="2263"/>
-        <w:gridCol w:w="7371"/>
+        <w:gridCol w:w="1873"/>
+        <w:gridCol w:w="7761"/>
       </w:tblGrid>
       <w:tr>
         <w:tc>
@@ -2149,22 +2546,31 @@
             <w:tcW w:w="7371" w:type="dxa"/>
           </w:tcPr>
           <w:p>
-            <w:r/>
-            <w:r>
-              <w:rPr>
-                <w:rFonts w:ascii="Arial" w:hAnsi="Arial"/>
-                <w:b/>
-                <w:sz w:val="20"/>
-              </w:rPr>
-            </w:r>
-            <w:r>
-              <w:rPr>
-                <w:rFonts w:ascii="Arial" w:hAnsi="Arial"/>
-                <w:b w:val="0"/>
-                <w:sz w:val="20"/>
-              </w:rPr>
-              <w:t>[Inserir Link do Vídeo Gravado Aqui — Roteiro completo de 5 min em docs/Situacao-Problema-3/03-Roteiro-Video-5-Minutos.md]</w:t>
-            </w:r>
+            <w:pPr>
+              <w:spacing w:line="360" w:lineRule="auto"/>
+              <w:rPr>
+                <w:rFonts w:ascii="Arial" w:hAnsi="Arial" w:cs="Arial"/>
+              </w:rPr>
+            </w:pPr>
+            <w:r>
+              <w:rPr>
+                <w:rFonts w:ascii="Arial" w:hAnsi="Arial"/>
+                <w:b/>
+                <w:i w:val="0"/>
+              </w:rPr>
+              <w:t xml:space="preserve"> </w:t>
+            </w:r>
+            <w:hyperlink r:id="rId13" w:history="1">
+              <w:r>
+                <w:rPr>
+                  <w:rStyle w:val="Hyperlink"/>
+                  <w:rFonts w:ascii="Arial" w:hAnsi="Arial" w:cs="Arial"/>
+                  <w:b/>
+                  <w:bCs/>
+                </w:rPr>
+                <w:t>[Inserir link do vídeo de até 5 min (Google Drive / YouTube)]</w:t>
+              </w:r>
+            </w:hyperlink>
           </w:p>
         </w:tc>
       </w:tr>
@@ -2180,7 +2586,7 @@
       </w:pPr>
     </w:p>
     <w:sectPr>
-      <w:headerReference w:type="default" r:id="rId9"/>
+      <w:headerReference w:type="default" r:id="rId14"/>
       <w:pgSz w:w="11906" w:h="16838"/>
       <w:pgMar w:top="2694" w:right="1701" w:bottom="1417" w:left="1701" w:header="708" w:footer="708" w:gutter="0"/>
       <w:cols w:space="708"/>
@@ -2191,7 +2597,7 @@
 </file>
 
 <file path=word/endnotes.xml><?xml version="1.0" encoding="utf-8"?>
-<w:endnotes xmlns:wpc="http://schemas.microsoft.com/office/word/2010/wordprocessingCanvas" xmlns:cx="http://schemas.microsoft.com/office/drawing/2014/chartex" xmlns:cx1="http://schemas.microsoft.com/office/drawing/2015/9/8/chartex" xmlns:cx2="http://schemas.microsoft.com/office/drawing/2015/10/21/chartex" xmlns:cx3="http://schemas.microsoft.com/office/drawing/2016/5/9/chartex" xmlns:cx4="http://schemas.microsoft.com/office/drawing/2016/5/10/chartex" xmlns:cx5="http://schemas.microsoft.com/office/drawing/2016/5/11/chartex" xmlns:cx6="http://schemas.microsoft.com/office/drawing/2016/5/12/chartex" xmlns:cx7="http://schemas.microsoft.com/office/drawing/2016/5/13/chartex" xmlns:cx8="http://schemas.microsoft.com/office/drawing/2016/5/14/chartex" xmlns:mc="http://schemas.openxmlformats.org/markup-compatibility/2006" xmlns:aink="http://schemas.microsoft.com/office/drawing/2016/ink" xmlns:am3d="http://schemas.microsoft.com/office/drawing/2017/model3d" xmlns:o="urn:schemas-microsoft-com:office:office" xmlns:oel="http://schemas.microsoft.com/office/2019/extlst" xmlns:r="http://schemas.openxmlformats.org/officeDocument/2006/relationships" xmlns:m="http://schemas.openxmlformats.org/officeDocument/2006/math" xmlns:v="urn:schemas-microsoft-com:vml" xmlns:wp14="http://schemas.microsoft.com/office/word/2010/wordprocessingDrawing" xmlns:wp="http://schemas.openxmlformats.org/drawingml/2006/wordprocessingDrawing" xmlns:w10="urn:schemas-microsoft-com:office:word" xmlns:w="http://schemas.openxmlformats.org/wordprocessingml/2006/main" xmlns:w14="http://schemas.microsoft.com/office/word/2010/wordml" xmlns:w15="http://schemas.microsoft.com/office/word/2012/wordml" xmlns:w16cex="http://schemas.microsoft.com/office/word/2018/wordml/cex" xmlns:w16cid="http://schemas.microsoft.com/office/word/2016/wordml/cid" xmlns:w16="http://schemas.microsoft.com/office/word/2018/wordml" xmlns:w16sdtdh="http://schemas.microsoft.com/office/word/2020/wordml/sdtdatahash" xmlns:w16se="http://schemas.microsoft.com/office/word/2015/wordml/symex" xmlns:wpg="http://schemas.microsoft.com/office/word/2010/wordprocessingGroup" xmlns:wpi="http://schemas.microsoft.com/office/word/2010/wordprocessingInk" xmlns:wne="http://schemas.microsoft.com/office/word/2006/wordml" xmlns:wps="http://schemas.microsoft.com/office/word/2010/wordprocessingShape" mc:Ignorable="w14 w15 w16se w16cid w16 w16cex w16sdtdh wp14">
+<w:endnotes xmlns:wpc="http://schemas.microsoft.com/office/word/2010/wordprocessingCanvas" xmlns:cx="http://schemas.microsoft.com/office/drawing/2014/chartex" xmlns:cx1="http://schemas.microsoft.com/office/drawing/2015/9/8/chartex" xmlns:cx2="http://schemas.microsoft.com/office/drawing/2015/10/21/chartex" xmlns:cx3="http://schemas.microsoft.com/office/drawing/2016/5/9/chartex" xmlns:cx4="http://schemas.microsoft.com/office/drawing/2016/5/10/chartex" xmlns:cx5="http://schemas.microsoft.com/office/drawing/2016/5/11/chartex" xmlns:cx6="http://schemas.microsoft.com/office/drawing/2016/5/12/chartex" xmlns:cx7="http://schemas.microsoft.com/office/drawing/2016/5/13/chartex" xmlns:cx8="http://schemas.microsoft.com/office/drawing/2016/5/14/chartex" xmlns:mc="http://schemas.openxmlformats.org/markup-compatibility/2006" xmlns:aink="http://schemas.microsoft.com/office/drawing/2016/ink" xmlns:am3d="http://schemas.microsoft.com/office/drawing/2017/model3d" xmlns:o="urn:schemas-microsoft-com:office:office" xmlns:oel="http://schemas.microsoft.com/office/2019/extlst" xmlns:r="http://schemas.openxmlformats.org/officeDocument/2006/relationships" xmlns:m="http://schemas.openxmlformats.org/officeDocument/2006/math" xmlns:v="urn:schemas-microsoft-com:vml" xmlns:wp14="http://schemas.microsoft.com/office/word/2010/wordprocessingDrawing" xmlns:wp="http://schemas.openxmlformats.org/drawingml/2006/wordprocessingDrawing" xmlns:w10="urn:schemas-microsoft-com:office:word" xmlns:w="http://schemas.openxmlformats.org/wordprocessingml/2006/main" xmlns:w14="http://schemas.microsoft.com/office/word/2010/wordml" xmlns:w15="http://schemas.microsoft.com/office/word/2012/wordml" xmlns:w16cex="http://schemas.microsoft.com/office/word/2018/wordml/cex" xmlns:w16cid="http://schemas.microsoft.com/office/word/2016/wordml/cid" xmlns:w16="http://schemas.microsoft.com/office/word/2018/wordml" xmlns:w16du="http://schemas.microsoft.com/office/word/2023/wordml/word16du" xmlns:w16sdtdh="http://schemas.microsoft.com/office/word/2020/wordml/sdtdatahash" xmlns:w16sdtfl="http://schemas.microsoft.com/office/word/2024/wordml/sdtformatlock" xmlns:w16se="http://schemas.microsoft.com/office/word/2015/wordml/symex" xmlns:wpg="http://schemas.microsoft.com/office/word/2010/wordprocessingGroup" xmlns:wpi="http://schemas.microsoft.com/office/word/2010/wordprocessingInk" xmlns:wne="http://schemas.microsoft.com/office/word/2006/wordml" xmlns:wps="http://schemas.microsoft.com/office/word/2010/wordprocessingShape" mc:Ignorable="w14 w15 w16se w16cid w16 w16cex w16sdtdh w16sdtfl w16du wp14">
   <w:endnote w:type="separator" w:id="-1">
     <w:p>
       <w:pPr>
@@ -2216,7 +2622,7 @@
 </file>
 
 <file path=word/footnotes.xml><?xml version="1.0" encoding="utf-8"?>
-<w:footnotes xmlns:wpc="http://schemas.microsoft.com/office/word/2010/wordprocessingCanvas" xmlns:cx="http://schemas.microsoft.com/office/drawing/2014/chartex" xmlns:cx1="http://schemas.microsoft.com/office/drawing/2015/9/8/chartex" xmlns:cx2="http://schemas.microsoft.com/office/drawing/2015/10/21/chartex" xmlns:cx3="http://schemas.microsoft.com/office/drawing/2016/5/9/chartex" xmlns:cx4="http://schemas.microsoft.com/office/drawing/2016/5/10/chartex" xmlns:cx5="http://schemas.microsoft.com/office/drawing/2016/5/11/chartex" xmlns:cx6="http://schemas.microsoft.com/office/drawing/2016/5/12/chartex" xmlns:cx7="http://schemas.microsoft.com/office/drawing/2016/5/13/chartex" xmlns:cx8="http://schemas.microsoft.com/office/drawing/2016/5/14/chartex" xmlns:mc="http://schemas.openxmlformats.org/markup-compatibility/2006" xmlns:aink="http://schemas.microsoft.com/office/drawing/2016/ink" xmlns:am3d="http://schemas.microsoft.com/office/drawing/2017/model3d" xmlns:o="urn:schemas-microsoft-com:office:office" xmlns:oel="http://schemas.microsoft.com/office/2019/extlst" xmlns:r="http://schemas.openxmlformats.org/officeDocument/2006/relationships" xmlns:m="http://schemas.openxmlformats.org/officeDocument/2006/math" xmlns:v="urn:schemas-microsoft-com:vml" xmlns:wp14="http://schemas.microsoft.com/office/word/2010/wordprocessingDrawing" xmlns:wp="http://schemas.openxmlformats.org/drawingml/2006/wordprocessingDrawing" xmlns:w10="urn:schemas-microsoft-com:office:word" xmlns:w="http://schemas.openxmlformats.org/wordprocessingml/2006/main" xmlns:w14="http://schemas.microsoft.com/office/word/2010/wordml" xmlns:w15="http://schemas.microsoft.com/office/word/2012/wordml" xmlns:w16cex="http://schemas.microsoft.com/office/word/2018/wordml/cex" xmlns:w16cid="http://schemas.microsoft.com/office/word/2016/wordml/cid" xmlns:w16="http://schemas.microsoft.com/office/word/2018/wordml" xmlns:w16sdtdh="http://schemas.microsoft.com/office/word/2020/wordml/sdtdatahash" xmlns:w16se="http://schemas.microsoft.com/office/word/2015/wordml/symex" xmlns:wpg="http://schemas.microsoft.com/office/word/2010/wordprocessingGroup" xmlns:wpi="http://schemas.microsoft.com/office/word/2010/wordprocessingInk" xmlns:wne="http://schemas.microsoft.com/office/word/2006/wordml" xmlns:wps="http://schemas.microsoft.com/office/word/2010/wordprocessingShape" mc:Ignorable="w14 w15 w16se w16cid w16 w16cex w16sdtdh wp14">
+<w:footnotes xmlns:wpc="http://schemas.microsoft.com/office/word/2010/wordprocessingCanvas" xmlns:cx="http://schemas.microsoft.com/office/drawing/2014/chartex" xmlns:cx1="http://schemas.microsoft.com/office/drawing/2015/9/8/chartex" xmlns:cx2="http://schemas.microsoft.com/office/drawing/2015/10/21/chartex" xmlns:cx3="http://schemas.microsoft.com/office/drawing/2016/5/9/chartex" xmlns:cx4="http://schemas.microsoft.com/office/drawing/2016/5/10/chartex" xmlns:cx5="http://schemas.microsoft.com/office/drawing/2016/5/11/chartex" xmlns:cx6="http://schemas.microsoft.com/office/drawing/2016/5/12/chartex" xmlns:cx7="http://schemas.microsoft.com/office/drawing/2016/5/13/chartex" xmlns:cx8="http://schemas.microsoft.com/office/drawing/2016/5/14/chartex" xmlns:mc="http://schemas.openxmlformats.org/markup-compatibility/2006" xmlns:aink="http://schemas.microsoft.com/office/drawing/2016/ink" xmlns:am3d="http://schemas.microsoft.com/office/drawing/2017/model3d" xmlns:o="urn:schemas-microsoft-com:office:office" xmlns:oel="http://schemas.microsoft.com/office/2019/extlst" xmlns:r="http://schemas.openxmlformats.org/officeDocument/2006/relationships" xmlns:m="http://schemas.openxmlformats.org/officeDocument/2006/math" xmlns:v="urn:schemas-microsoft-com:vml" xmlns:wp14="http://schemas.microsoft.com/office/word/2010/wordprocessingDrawing" xmlns:wp="http://schemas.openxmlformats.org/drawingml/2006/wordprocessingDrawing" xmlns:w10="urn:schemas-microsoft-com:office:word" xmlns:w="http://schemas.openxmlformats.org/wordprocessingml/2006/main" xmlns:w14="http://schemas.microsoft.com/office/word/2010/wordml" xmlns:w15="http://schemas.microsoft.com/office/word/2012/wordml" xmlns:w16cex="http://schemas.microsoft.com/office/word/2018/wordml/cex" xmlns:w16cid="http://schemas.microsoft.com/office/word/2016/wordml/cid" xmlns:w16="http://schemas.microsoft.com/office/word/2018/wordml" xmlns:w16du="http://schemas.microsoft.com/office/word/2023/wordml/word16du" xmlns:w16sdtdh="http://schemas.microsoft.com/office/word/2020/wordml/sdtdatahash" xmlns:w16sdtfl="http://schemas.microsoft.com/office/word/2024/wordml/sdtformatlock" xmlns:w16se="http://schemas.microsoft.com/office/word/2015/wordml/symex" xmlns:wpg="http://schemas.microsoft.com/office/word/2010/wordprocessingGroup" xmlns:wpi="http://schemas.microsoft.com/office/word/2010/wordprocessingInk" xmlns:wne="http://schemas.microsoft.com/office/word/2006/wordml" xmlns:wps="http://schemas.microsoft.com/office/word/2010/wordprocessingShape" mc:Ignorable="w14 w15 w16se w16cid w16 w16cex w16sdtdh w16sdtfl w16du wp14">
   <w:footnote w:type="separator" w:id="-1">
     <w:p>
       <w:pPr>
@@ -2241,10 +2647,10 @@
 </file>
 
 <file path=word/header1.xml><?xml version="1.0" encoding="utf-8"?>
-<w:hdr xmlns:wpc="http://schemas.microsoft.com/office/word/2010/wordprocessingCanvas" xmlns:cx="http://schemas.microsoft.com/office/drawing/2014/chartex" xmlns:cx1="http://schemas.microsoft.com/office/drawing/2015/9/8/chartex" xmlns:cx2="http://schemas.microsoft.com/office/drawing/2015/10/21/chartex" xmlns:cx3="http://schemas.microsoft.com/office/drawing/2016/5/9/chartex" xmlns:cx4="http://schemas.microsoft.com/office/drawing/2016/5/10/chartex" xmlns:cx5="http://schemas.microsoft.com/office/drawing/2016/5/11/chartex" xmlns:cx6="http://schemas.microsoft.com/office/drawing/2016/5/12/chartex" xmlns:cx7="http://schemas.microsoft.com/office/drawing/2016/5/13/chartex" xmlns:cx8="http://schemas.microsoft.com/office/drawing/2016/5/14/chartex" xmlns:mc="http://schemas.openxmlformats.org/markup-compatibility/2006" xmlns:aink="http://schemas.microsoft.com/office/drawing/2016/ink" xmlns:am3d="http://schemas.microsoft.com/office/drawing/2017/model3d" xmlns:o="urn:schemas-microsoft-com:office:office" xmlns:oel="http://schemas.microsoft.com/office/2019/extlst" xmlns:r="http://schemas.openxmlformats.org/officeDocument/2006/relationships" xmlns:m="http://schemas.openxmlformats.org/officeDocument/2006/math" xmlns:v="urn:schemas-microsoft-com:vml" xmlns:wp14="http://schemas.microsoft.com/office/word/2010/wordprocessingDrawing" xmlns:wp="http://schemas.openxmlformats.org/drawingml/2006/wordprocessingDrawing" xmlns:w10="urn:schemas-microsoft-com:office:word" xmlns:w="http://schemas.openxmlformats.org/wordprocessingml/2006/main" xmlns:w14="http://schemas.microsoft.com/office/word/2010/wordml" xmlns:w15="http://schemas.microsoft.com/office/word/2012/wordml" xmlns:w16cex="http://schemas.microsoft.com/office/word/2018/wordml/cex" xmlns:w16cid="http://schemas.microsoft.com/office/word/2016/wordml/cid" xmlns:w16="http://schemas.microsoft.com/office/word/2018/wordml" xmlns:w16sdtdh="http://schemas.microsoft.com/office/word/2020/wordml/sdtdatahash" xmlns:w16se="http://schemas.microsoft.com/office/word/2015/wordml/symex" xmlns:wpg="http://schemas.microsoft.com/office/word/2010/wordprocessingGroup" xmlns:wpi="http://schemas.microsoft.com/office/word/2010/wordprocessingInk" xmlns:wne="http://schemas.microsoft.com/office/word/2006/wordml" xmlns:wps="http://schemas.microsoft.com/office/word/2010/wordprocessingShape" mc:Ignorable="w14 w15 w16se w16cid w16 w16cex w16sdtdh wp14">
+<w:hdr xmlns:wpc="http://schemas.microsoft.com/office/word/2010/wordprocessingCanvas" xmlns:cx="http://schemas.microsoft.com/office/drawing/2014/chartex" xmlns:cx1="http://schemas.microsoft.com/office/drawing/2015/9/8/chartex" xmlns:cx2="http://schemas.microsoft.com/office/drawing/2015/10/21/chartex" xmlns:cx3="http://schemas.microsoft.com/office/drawing/2016/5/9/chartex" xmlns:cx4="http://schemas.microsoft.com/office/drawing/2016/5/10/chartex" xmlns:cx5="http://schemas.microsoft.com/office/drawing/2016/5/11/chartex" xmlns:cx6="http://schemas.microsoft.com/office/drawing/2016/5/12/chartex" xmlns:cx7="http://schemas.microsoft.com/office/drawing/2016/5/13/chartex" xmlns:cx8="http://schemas.microsoft.com/office/drawing/2016/5/14/chartex" xmlns:mc="http://schemas.openxmlformats.org/markup-compatibility/2006" xmlns:aink="http://schemas.microsoft.com/office/drawing/2016/ink" xmlns:am3d="http://schemas.microsoft.com/office/drawing/2017/model3d" xmlns:o="urn:schemas-microsoft-com:office:office" xmlns:oel="http://schemas.microsoft.com/office/2019/extlst" xmlns:r="http://schemas.openxmlformats.org/officeDocument/2006/relationships" xmlns:m="http://schemas.openxmlformats.org/officeDocument/2006/math" xmlns:v="urn:schemas-microsoft-com:vml" xmlns:wp14="http://schemas.microsoft.com/office/word/2010/wordprocessingDrawing" xmlns:wp="http://schemas.openxmlformats.org/drawingml/2006/wordprocessingDrawing" xmlns:w10="urn:schemas-microsoft-com:office:word" xmlns:w="http://schemas.openxmlformats.org/wordprocessingml/2006/main" xmlns:w14="http://schemas.microsoft.com/office/word/2010/wordml" xmlns:w15="http://schemas.microsoft.com/office/word/2012/wordml" xmlns:w16cex="http://schemas.microsoft.com/office/word/2018/wordml/cex" xmlns:w16cid="http://schemas.microsoft.com/office/word/2016/wordml/cid" xmlns:w16="http://schemas.microsoft.com/office/word/2018/wordml" xmlns:w16du="http://schemas.microsoft.com/office/word/2023/wordml/word16du" xmlns:w16sdtdh="http://schemas.microsoft.com/office/word/2020/wordml/sdtdatahash" xmlns:w16sdtfl="http://schemas.microsoft.com/office/word/2024/wordml/sdtformatlock" xmlns:w16se="http://schemas.microsoft.com/office/word/2015/wordml/symex" xmlns:wpg="http://schemas.microsoft.com/office/word/2010/wordprocessingGroup" xmlns:wpi="http://schemas.microsoft.com/office/word/2010/wordprocessingInk" xmlns:wne="http://schemas.microsoft.com/office/word/2006/wordml" xmlns:wps="http://schemas.microsoft.com/office/word/2010/wordprocessingShape" mc:Ignorable="w14 w15 w16se w16cid w16 w16cex w16sdtdh w16sdtfl w16du wp14">
   <w:p>
     <w:pPr>
-      <w:pStyle w:val="Cabealho"/>
+      <w:pStyle w:val="Header"/>
       <w:tabs>
         <w:tab w:val="clear" w:pos="4252"/>
         <w:tab w:val="clear" w:pos="8504"/>
@@ -2316,7 +2722,7 @@
 </file>
 
 <file path=word/numbering.xml><?xml version="1.0" encoding="utf-8"?>
-<w:numbering xmlns:wpc="http://schemas.microsoft.com/office/word/2010/wordprocessingCanvas" xmlns:cx="http://schemas.microsoft.com/office/drawing/2014/chartex" xmlns:cx1="http://schemas.microsoft.com/office/drawing/2015/9/8/chartex" xmlns:cx2="http://schemas.microsoft.com/office/drawing/2015/10/21/chartex" xmlns:cx3="http://schemas.microsoft.com/office/drawing/2016/5/9/chartex" xmlns:cx4="http://schemas.microsoft.com/office/drawing/2016/5/10/chartex" xmlns:cx5="http://schemas.microsoft.com/office/drawing/2016/5/11/chartex" xmlns:cx6="http://schemas.microsoft.com/office/drawing/2016/5/12/chartex" xmlns:cx7="http://schemas.microsoft.com/office/drawing/2016/5/13/chartex" xmlns:cx8="http://schemas.microsoft.com/office/drawing/2016/5/14/chartex" xmlns:mc="http://schemas.openxmlformats.org/markup-compatibility/2006" xmlns:aink="http://schemas.microsoft.com/office/drawing/2016/ink" xmlns:am3d="http://schemas.microsoft.com/office/drawing/2017/model3d" xmlns:o="urn:schemas-microsoft-com:office:office" xmlns:oel="http://schemas.microsoft.com/office/2019/extlst" xmlns:r="http://schemas.openxmlformats.org/officeDocument/2006/relationships" xmlns:m="http://schemas.openxmlformats.org/officeDocument/2006/math" xmlns:v="urn:schemas-microsoft-com:vml" xmlns:wp14="http://schemas.microsoft.com/office/word/2010/wordprocessingDrawing" xmlns:wp="http://schemas.openxmlformats.org/drawingml/2006/wordprocessingDrawing" xmlns:w10="urn:schemas-microsoft-com:office:word" xmlns:w="http://schemas.openxmlformats.org/wordprocessingml/2006/main" xmlns:w14="http://schemas.microsoft.com/office/word/2010/wordml" xmlns:w15="http://schemas.microsoft.com/office/word/2012/wordml" xmlns:w16cex="http://schemas.microsoft.com/office/word/2018/wordml/cex" xmlns:w16cid="http://schemas.microsoft.com/office/word/2016/wordml/cid" xmlns:w16="http://schemas.microsoft.com/office/word/2018/wordml" xmlns:w16sdtdh="http://schemas.microsoft.com/office/word/2020/wordml/sdtdatahash" xmlns:w16se="http://schemas.microsoft.com/office/word/2015/wordml/symex" xmlns:wpg="http://schemas.microsoft.com/office/word/2010/wordprocessingGroup" xmlns:wpi="http://schemas.microsoft.com/office/word/2010/wordprocessingInk" xmlns:wne="http://schemas.microsoft.com/office/word/2006/wordml" xmlns:wps="http://schemas.microsoft.com/office/word/2010/wordprocessingShape" mc:Ignorable="w14 w15 w16se w16cid w16 w16cex w16sdtdh wp14">
+<w:numbering xmlns:wpc="http://schemas.microsoft.com/office/word/2010/wordprocessingCanvas" xmlns:cx="http://schemas.microsoft.com/office/drawing/2014/chartex" xmlns:cx1="http://schemas.microsoft.com/office/drawing/2015/9/8/chartex" xmlns:cx2="http://schemas.microsoft.com/office/drawing/2015/10/21/chartex" xmlns:cx3="http://schemas.microsoft.com/office/drawing/2016/5/9/chartex" xmlns:cx4="http://schemas.microsoft.com/office/drawing/2016/5/10/chartex" xmlns:cx5="http://schemas.microsoft.com/office/drawing/2016/5/11/chartex" xmlns:cx6="http://schemas.microsoft.com/office/drawing/2016/5/12/chartex" xmlns:cx7="http://schemas.microsoft.com/office/drawing/2016/5/13/chartex" xmlns:cx8="http://schemas.microsoft.com/office/drawing/2016/5/14/chartex" xmlns:mc="http://schemas.openxmlformats.org/markup-compatibility/2006" xmlns:aink="http://schemas.microsoft.com/office/drawing/2016/ink" xmlns:am3d="http://schemas.microsoft.com/office/drawing/2017/model3d" xmlns:o="urn:schemas-microsoft-com:office:office" xmlns:oel="http://schemas.microsoft.com/office/2019/extlst" xmlns:r="http://schemas.openxmlformats.org/officeDocument/2006/relationships" xmlns:m="http://schemas.openxmlformats.org/officeDocument/2006/math" xmlns:v="urn:schemas-microsoft-com:vml" xmlns:wp14="http://schemas.microsoft.com/office/word/2010/wordprocessingDrawing" xmlns:wp="http://schemas.openxmlformats.org/drawingml/2006/wordprocessingDrawing" xmlns:w10="urn:schemas-microsoft-com:office:word" xmlns:w="http://schemas.openxmlformats.org/wordprocessingml/2006/main" xmlns:w14="http://schemas.microsoft.com/office/word/2010/wordml" xmlns:w15="http://schemas.microsoft.com/office/word/2012/wordml" xmlns:w16cex="http://schemas.microsoft.com/office/word/2018/wordml/cex" xmlns:w16cid="http://schemas.microsoft.com/office/word/2016/wordml/cid" xmlns:w16="http://schemas.microsoft.com/office/word/2018/wordml" xmlns:w16du="http://schemas.microsoft.com/office/word/2023/wordml/word16du" xmlns:w16sdtdh="http://schemas.microsoft.com/office/word/2020/wordml/sdtdatahash" xmlns:w16sdtfl="http://schemas.microsoft.com/office/word/2024/wordml/sdtformatlock" xmlns:w16se="http://schemas.microsoft.com/office/word/2015/wordml/symex" xmlns:wpg="http://schemas.microsoft.com/office/word/2010/wordprocessingGroup" xmlns:wpi="http://schemas.microsoft.com/office/word/2010/wordprocessingInk" xmlns:wne="http://schemas.microsoft.com/office/word/2006/wordml" xmlns:wps="http://schemas.microsoft.com/office/word/2010/wordprocessingShape" mc:Ignorable="w14 w15 w16se w16cid w16 w16cex w16sdtdh w16sdtfl w16du wp14">
   <w:abstractNum w:abstractNumId="0" w15:restartNumberingAfterBreak="0">
     <w:nsid w:val="36EF3C7F"/>
     <w:multiLevelType w:val="hybridMultilevel"/>
@@ -2430,14 +2836,166 @@
       </w:rPr>
     </w:lvl>
   </w:abstractNum>
+  <w:abstractNum w:abstractNumId="1" w15:restartNumberingAfterBreak="0">
+    <w:nsid w:val="512137B2"/>
+    <w:multiLevelType w:val="multilevel"/>
+    <w:tmpl w:val="B300B80A"/>
+    <w:lvl w:ilvl="0">
+      <w:start w:val="1"/>
+      <w:numFmt w:val="bullet"/>
+      <w:lvlText w:val=""/>
+      <w:lvlJc w:val="left"/>
+      <w:pPr>
+        <w:tabs>
+          <w:tab w:val="num" w:pos="720"/>
+        </w:tabs>
+        <w:ind w:left="720" w:hanging="360"/>
+      </w:pPr>
+      <w:rPr>
+        <w:rFonts w:ascii="Symbol" w:hAnsi="Symbol" w:hint="default"/>
+        <w:sz w:val="20"/>
+      </w:rPr>
+    </w:lvl>
+    <w:lvl w:ilvl="1" w:tentative="1">
+      <w:start w:val="1"/>
+      <w:numFmt w:val="bullet"/>
+      <w:lvlText w:val="o"/>
+      <w:lvlJc w:val="left"/>
+      <w:pPr>
+        <w:tabs>
+          <w:tab w:val="num" w:pos="1440"/>
+        </w:tabs>
+        <w:ind w:left="1440" w:hanging="360"/>
+      </w:pPr>
+      <w:rPr>
+        <w:rFonts w:ascii="Courier New" w:hAnsi="Courier New" w:hint="default"/>
+        <w:sz w:val="20"/>
+      </w:rPr>
+    </w:lvl>
+    <w:lvl w:ilvl="2" w:tentative="1">
+      <w:start w:val="1"/>
+      <w:numFmt w:val="bullet"/>
+      <w:lvlText w:val=""/>
+      <w:lvlJc w:val="left"/>
+      <w:pPr>
+        <w:tabs>
+          <w:tab w:val="num" w:pos="2160"/>
+        </w:tabs>
+        <w:ind w:left="2160" w:hanging="360"/>
+      </w:pPr>
+      <w:rPr>
+        <w:rFonts w:ascii="Wingdings" w:hAnsi="Wingdings" w:hint="default"/>
+        <w:sz w:val="20"/>
+      </w:rPr>
+    </w:lvl>
+    <w:lvl w:ilvl="3" w:tentative="1">
+      <w:start w:val="1"/>
+      <w:numFmt w:val="bullet"/>
+      <w:lvlText w:val=""/>
+      <w:lvlJc w:val="left"/>
+      <w:pPr>
+        <w:tabs>
+          <w:tab w:val="num" w:pos="2880"/>
+        </w:tabs>
+        <w:ind w:left="2880" w:hanging="360"/>
+      </w:pPr>
+      <w:rPr>
+        <w:rFonts w:ascii="Wingdings" w:hAnsi="Wingdings" w:hint="default"/>
+        <w:sz w:val="20"/>
+      </w:rPr>
+    </w:lvl>
+    <w:lvl w:ilvl="4" w:tentative="1">
+      <w:start w:val="1"/>
+      <w:numFmt w:val="bullet"/>
+      <w:lvlText w:val=""/>
+      <w:lvlJc w:val="left"/>
+      <w:pPr>
+        <w:tabs>
+          <w:tab w:val="num" w:pos="3600"/>
+        </w:tabs>
+        <w:ind w:left="3600" w:hanging="360"/>
+      </w:pPr>
+      <w:rPr>
+        <w:rFonts w:ascii="Wingdings" w:hAnsi="Wingdings" w:hint="default"/>
+        <w:sz w:val="20"/>
+      </w:rPr>
+    </w:lvl>
+    <w:lvl w:ilvl="5" w:tentative="1">
+      <w:start w:val="1"/>
+      <w:numFmt w:val="bullet"/>
+      <w:lvlText w:val=""/>
+      <w:lvlJc w:val="left"/>
+      <w:pPr>
+        <w:tabs>
+          <w:tab w:val="num" w:pos="4320"/>
+        </w:tabs>
+        <w:ind w:left="4320" w:hanging="360"/>
+      </w:pPr>
+      <w:rPr>
+        <w:rFonts w:ascii="Wingdings" w:hAnsi="Wingdings" w:hint="default"/>
+        <w:sz w:val="20"/>
+      </w:rPr>
+    </w:lvl>
+    <w:lvl w:ilvl="6" w:tentative="1">
+      <w:start w:val="1"/>
+      <w:numFmt w:val="bullet"/>
+      <w:lvlText w:val=""/>
+      <w:lvlJc w:val="left"/>
+      <w:pPr>
+        <w:tabs>
+          <w:tab w:val="num" w:pos="5040"/>
+        </w:tabs>
+        <w:ind w:left="5040" w:hanging="360"/>
+      </w:pPr>
+      <w:rPr>
+        <w:rFonts w:ascii="Wingdings" w:hAnsi="Wingdings" w:hint="default"/>
+        <w:sz w:val="20"/>
+      </w:rPr>
+    </w:lvl>
+    <w:lvl w:ilvl="7" w:tentative="1">
+      <w:start w:val="1"/>
+      <w:numFmt w:val="bullet"/>
+      <w:lvlText w:val=""/>
+      <w:lvlJc w:val="left"/>
+      <w:pPr>
+        <w:tabs>
+          <w:tab w:val="num" w:pos="5760"/>
+        </w:tabs>
+        <w:ind w:left="5760" w:hanging="360"/>
+      </w:pPr>
+      <w:rPr>
+        <w:rFonts w:ascii="Wingdings" w:hAnsi="Wingdings" w:hint="default"/>
+        <w:sz w:val="20"/>
+      </w:rPr>
+    </w:lvl>
+    <w:lvl w:ilvl="8" w:tentative="1">
+      <w:start w:val="1"/>
+      <w:numFmt w:val="bullet"/>
+      <w:lvlText w:val=""/>
+      <w:lvlJc w:val="left"/>
+      <w:pPr>
+        <w:tabs>
+          <w:tab w:val="num" w:pos="6480"/>
+        </w:tabs>
+        <w:ind w:left="6480" w:hanging="360"/>
+      </w:pPr>
+      <w:rPr>
+        <w:rFonts w:ascii="Wingdings" w:hAnsi="Wingdings" w:hint="default"/>
+        <w:sz w:val="20"/>
+      </w:rPr>
+    </w:lvl>
+  </w:abstractNum>
   <w:num w:numId="1" w16cid:durableId="1068571531">
     <w:abstractNumId w:val="0"/>
+  </w:num>
+  <w:num w:numId="2" w16cid:durableId="2068339669">
+    <w:abstractNumId w:val="1"/>
   </w:num>
 </w:numbering>
 </file>
 
 <file path=word/styles.xml><?xml version="1.0" encoding="utf-8"?>
-<w:styles xmlns:mc="http://schemas.openxmlformats.org/markup-compatibility/2006" xmlns:r="http://schemas.openxmlformats.org/officeDocument/2006/relationships" xmlns:w="http://schemas.openxmlformats.org/wordprocessingml/2006/main" xmlns:w14="http://schemas.microsoft.com/office/word/2010/wordml" xmlns:w15="http://schemas.microsoft.com/office/word/2012/wordml" xmlns:w16cex="http://schemas.microsoft.com/office/word/2018/wordml/cex" xmlns:w16cid="http://schemas.microsoft.com/office/word/2016/wordml/cid" xmlns:w16="http://schemas.microsoft.com/office/word/2018/wordml" xmlns:w16sdtdh="http://schemas.microsoft.com/office/word/2020/wordml/sdtdatahash" xmlns:w16se="http://schemas.microsoft.com/office/word/2015/wordml/symex" mc:Ignorable="w14 w15 w16se w16cid w16 w16cex w16sdtdh">
+<w:styles xmlns:mc="http://schemas.openxmlformats.org/markup-compatibility/2006" xmlns:r="http://schemas.openxmlformats.org/officeDocument/2006/relationships" xmlns:w="http://schemas.openxmlformats.org/wordprocessingml/2006/main" xmlns:w14="http://schemas.microsoft.com/office/word/2010/wordml" xmlns:w15="http://schemas.microsoft.com/office/word/2012/wordml" xmlns:w16cex="http://schemas.microsoft.com/office/word/2018/wordml/cex" xmlns:w16cid="http://schemas.microsoft.com/office/word/2016/wordml/cid" xmlns:w16="http://schemas.microsoft.com/office/word/2018/wordml" xmlns:w16du="http://schemas.microsoft.com/office/word/2023/wordml/word16du" xmlns:w16sdtdh="http://schemas.microsoft.com/office/word/2020/wordml/sdtdatahash" xmlns:w16sdtfl="http://schemas.microsoft.com/office/word/2024/wordml/sdtformatlock" xmlns:w16se="http://schemas.microsoft.com/office/word/2015/wordml/symex" mc:Ignorable="w14 w15 w16se w16cid w16 w16cex w16sdtdh w16sdtfl w16du">
   <w:docDefaults>
     <w:rPrDefault>
       <w:rPr>
@@ -2836,13 +3394,13 @@
     <w:qFormat/>
     <w:rsid w:val="00BF6C99"/>
   </w:style>
-  <w:style w:type="character" w:default="1" w:styleId="Fontepargpadro">
+  <w:style w:type="character" w:default="1" w:styleId="DefaultParagraphFont">
     <w:name w:val="Default Paragraph Font"/>
     <w:uiPriority w:val="1"/>
     <w:semiHidden/>
     <w:unhideWhenUsed/>
   </w:style>
-  <w:style w:type="table" w:default="1" w:styleId="Tabelanormal">
+  <w:style w:type="table" w:default="1" w:styleId="TableNormal">
     <w:name w:val="Normal Table"/>
     <w:uiPriority w:val="99"/>
     <w:semiHidden/>
@@ -2857,16 +3415,16 @@
       </w:tblCellMar>
     </w:tblPr>
   </w:style>
-  <w:style w:type="numbering" w:default="1" w:styleId="Semlista">
+  <w:style w:type="numbering" w:default="1" w:styleId="NoList">
     <w:name w:val="No List"/>
     <w:uiPriority w:val="99"/>
     <w:semiHidden/>
     <w:unhideWhenUsed/>
   </w:style>
-  <w:style w:type="paragraph" w:styleId="Cabealho">
+  <w:style w:type="paragraph" w:styleId="Header">
     <w:name w:val="header"/>
     <w:basedOn w:val="Normal"/>
-    <w:link w:val="CabealhoChar"/>
+    <w:link w:val="HeaderChar"/>
     <w:uiPriority w:val="99"/>
     <w:unhideWhenUsed/>
     <w:rsid w:val="0047281F"/>
@@ -2878,17 +3436,17 @@
       <w:spacing w:after="0" w:line="240" w:lineRule="auto"/>
     </w:pPr>
   </w:style>
-  <w:style w:type="character" w:customStyle="1" w:styleId="CabealhoChar">
-    <w:name w:val="Cabeçalho Char"/>
-    <w:basedOn w:val="Fontepargpadro"/>
-    <w:link w:val="Cabealho"/>
+  <w:style w:type="character" w:customStyle="1" w:styleId="HeaderChar">
+    <w:name w:val="Header Char"/>
+    <w:basedOn w:val="DefaultParagraphFont"/>
+    <w:link w:val="Header"/>
     <w:uiPriority w:val="99"/>
     <w:rsid w:val="0047281F"/>
   </w:style>
-  <w:style w:type="paragraph" w:styleId="Rodap">
+  <w:style w:type="paragraph" w:styleId="Footer">
     <w:name w:val="footer"/>
     <w:basedOn w:val="Normal"/>
-    <w:link w:val="RodapChar"/>
+    <w:link w:val="FooterChar"/>
     <w:uiPriority w:val="99"/>
     <w:unhideWhenUsed/>
     <w:rsid w:val="0047281F"/>
@@ -2900,14 +3458,14 @@
       <w:spacing w:after="0" w:line="240" w:lineRule="auto"/>
     </w:pPr>
   </w:style>
-  <w:style w:type="character" w:customStyle="1" w:styleId="RodapChar">
-    <w:name w:val="Rodapé Char"/>
-    <w:basedOn w:val="Fontepargpadro"/>
-    <w:link w:val="Rodap"/>
+  <w:style w:type="character" w:customStyle="1" w:styleId="FooterChar">
+    <w:name w:val="Footer Char"/>
+    <w:basedOn w:val="DefaultParagraphFont"/>
+    <w:link w:val="Footer"/>
     <w:uiPriority w:val="99"/>
     <w:rsid w:val="0047281F"/>
   </w:style>
-  <w:style w:type="paragraph" w:styleId="PargrafodaLista">
+  <w:style w:type="paragraph" w:styleId="ListParagraph">
     <w:name w:val="List Paragraph"/>
     <w:basedOn w:val="Normal"/>
     <w:uiPriority w:val="34"/>
@@ -2918,9 +3476,9 @@
       <w:contextualSpacing/>
     </w:pPr>
   </w:style>
-  <w:style w:type="table" w:styleId="Tabelacomgrade">
+  <w:style w:type="table" w:styleId="TableGrid">
     <w:name w:val="Table Grid"/>
-    <w:basedOn w:val="Tabelanormal"/>
+    <w:basedOn w:val="TableNormal"/>
     <w:uiPriority w:val="39"/>
     <w:rsid w:val="00CD572A"/>
     <w:pPr>
@@ -2939,7 +3497,7 @@
   </w:style>
   <w:style w:type="character" w:styleId="Hyperlink">
     <w:name w:val="Hyperlink"/>
-    <w:basedOn w:val="Fontepargpadro"/>
+    <w:basedOn w:val="DefaultParagraphFont"/>
     <w:uiPriority w:val="99"/>
     <w:unhideWhenUsed/>
     <w:rsid w:val="00F72815"/>
@@ -2948,9 +3506,9 @@
       <w:u w:val="single"/>
     </w:rPr>
   </w:style>
-  <w:style w:type="character" w:styleId="MenoPendente">
+  <w:style w:type="character" w:styleId="UnresolvedMention">
     <w:name w:val="Unresolved Mention"/>
-    <w:basedOn w:val="Fontepargpadro"/>
+    <w:basedOn w:val="DefaultParagraphFont"/>
     <w:uiPriority w:val="99"/>
     <w:semiHidden/>
     <w:unhideWhenUsed/>
@@ -2960,9 +3518,9 @@
       <w:shd w:val="clear" w:color="auto" w:fill="E1DFDD"/>
     </w:rPr>
   </w:style>
-  <w:style w:type="character" w:styleId="HiperlinkVisitado">
+  <w:style w:type="character" w:styleId="FollowedHyperlink">
     <w:name w:val="FollowedHyperlink"/>
-    <w:basedOn w:val="Fontepargpadro"/>
+    <w:basedOn w:val="DefaultParagraphFont"/>
     <w:uiPriority w:val="99"/>
     <w:semiHidden/>
     <w:unhideWhenUsed/>

</xml_diff>

<commit_message>
fix(pit-ii): incorpora apontamentos reais dos prints nos laudos de teste e sanitiza mensagens de erro na API
</commit_message>
<xml_diff>
--- a/PIT_II_Entrega_Eduardo_Maticola.docx
+++ b/PIT_II_Entrega_Eduardo_Maticola.docx
@@ -1081,7 +1081,7 @@
                 <w:b w:val="0"/>
                 <w:i w:val="0"/>
               </w:rPr>
-              <w:t>Foi realizado o login no sistema com autenticação JWT e testada a visualização dos indicadores no Dashboard Principal, incluindo os filtros rápidos do Monitor de Reposição Crítica (Todos, Zerados e Baixo Estoque). Também foram realizados o cadastro manual de fornecedores e peças no almoxarifado e a movimentação de entrada e saída de itens. O saldo e os alertas visuais de criticidade foram atualizados corretamente.</w:t>
+              <w:t>Foi realizado o acesso ao módulo de Gestão de Kits e testada a visualização da composição detalhada do kit (A80 220V.2), a listagem das peças vinculadas com identificação de componentes exclusivos de painel elétrico e a exportação da ficha técnica do kit em formato CSV.</w:t>
             </w:r>
           </w:p>
         </w:tc>
@@ -1126,7 +1126,7 @@
                 <w:b w:val="0"/>
                 <w:i w:val="0"/>
               </w:rPr>
-              <w:t>Não foram encontrados erros que impedissem a movimentação de estoque. Como melhoria, foi identificada a necessidade de um campo dedicado para registrar o número da Nota Fiscal separadamente da justificativa e uma opção para importar vários produtos de uma Nota Fiscal Eletrônica (XML) de uma só vez, evitando o cadastro manual item por item.</w:t>
+              <w:t>Ao tentar adicionar à composição do kit um item do estoque (LC1D32B7) que já estava cadastrado naquele mesmo kit, o sistema retornou um erro de chave duplicada do banco de dados e exibiu a mensagem técnica da exceção (MySqlException: Duplicate entry) na notificação da tela. Deve-se validar previamente se o item já pertence ao kit e exibir um aviso amigável orientando o usuário a alterar a quantidade do item existente na tabela.</w:t>
             </w:r>
           </w:p>
         </w:tc>
@@ -1171,7 +1171,7 @@
                 <w:b w:val="0"/>
                 <w:i w:val="0"/>
               </w:rPr>
-              <w:t>Não foi testada a tela de Gestão de Usuários, pois o teste foi realizado utilizando um perfil de Operador, que possui restrição de acesso às funcionalidades exclusivas de Administrador.</w:t>
+              <w:t>Não foi testada a exclusão física do kit completo, mantendo os testes focados na manutenção dos itens internos da composição.</w:t>
             </w:r>
           </w:p>
         </w:tc>
@@ -1302,7 +1302,7 @@
                 <w:b w:val="0"/>
                 <w:i w:val="0"/>
               </w:rPr>
-              <w:t>Foi testado o módulo de Gestão de Kits e Linha de Manufatura, incluindo a criação de um novo kit, a configuração de sua composição (BOM) com marcação de peças exclusivas do painel elétrico e a operação de montagem de kits prontos. O sistema calculou corretamente a capacidade de montagem e realizou a baixa automática das peças no almoxarifado, além de permitir a desmontagem com estorno integral do saldo.</w:t>
+              <w:t>Foram testadas a abertura do modal Editar Parâmetros de um item dentro da composição do kit (D-ST 4), a alternância da marcação de componente de painel (isPainel) e a atualização da quantidade com valores normais de operação, recalculando corretamente a capacidade de montagem do kit.</w:t>
             </w:r>
           </w:p>
         </w:tc>
@@ -1347,7 +1347,7 @@
                 <w:b w:val="0"/>
                 <w:i w:val="0"/>
               </w:rPr>
-              <w:t>As operações de montagem e desmontagem funcionaram corretamente, porém observou-se que nas tabelas com grande quantidade de registros (como o catálogo de peças e de kits) não era possível clicar no cabeçalho das colunas (ID, Nome, Saldo Atual, Capacidade) para ordenar os dados em ordem crescente ou decrescente, dificultando a localização rápida dos itens com menor saldo.</w:t>
+              <w:t>Ao preencher o campo Quantidade no modal Editar Parâmetros com um número excessivamente alto (99999999999999999999999999) e salvar, a requisição retornou erro 400 (Bad Request) por ultrapassar o limite de um número inteiro na API, exibindo a mensagem genérica em inglês “One or more validation errors occurred.”. Deve-se limitar o valor máximo permitido para a quantidade e apresentar uma mensagem clara em português.</w:t>
             </w:r>
           </w:p>
         </w:tc>
@@ -1392,7 +1392,7 @@
                 <w:b w:val="0"/>
                 <w:i w:val="0"/>
               </w:rPr>
-              <w:t>Não foi testado o módulo de controle de Softwares e versões de CLPs, pois os testes foram concentrados no fluxo de montagem física de kits.</w:t>
+              <w:t>Não foi testada a operação de desmontagem de kits prontos, concentrando os testes na validação dos campos de edição da composição.</w:t>
             </w:r>
           </w:p>
         </w:tc>
@@ -1525,7 +1525,7 @@
                 <w:b w:val="0"/>
                 <w:i w:val="0"/>
               </w:rPr>
-              <w:t>Foi utilizado o Simulador de Produção Multi-Kits adicionando diferentes modelos de kits simultaneamente na fila de produção. Foram testados os filtros de foco operacional (Todos os Componentes, Exclusivo Apenas Painéis e Peças Gerais) e a verificação de viabilidade. O balanço estimado apontou corretamente as sobras e as faltas de matéria-prima sem alterar o estoque real.</w:t>
+              <w:t>Foi testado o módulo de Softwares e CLPs, incluindo a consulta de versões instaladas por cliente e dispositivo, a filtragem por status operacional e o preenchimento do formulário Cadastrar Nova Implantação de Software vinculando o registro a um kit da linha de produção (A40 380V).</w:t>
             </w:r>
           </w:p>
         </w:tc>
@@ -1570,7 +1570,7 @@
                 <w:b w:val="0"/>
                 <w:i w:val="0"/>
               </w:rPr>
-              <w:t>Ao exportar o relatório CSV do simulador e abrir o arquivo diretamente no Microsoft Excel em português, alguns caracteres acentuados apareceram desconfigurados devido à ausência de marcador UTF-8 BOM. Além disso, sugeriu-se agrupar os itens do relatório por fornecedor para facilitar o envio de cotações pelo setor de compras.</w:t>
+              <w:t>Durante o preenchimento do modal Cadastrar Nova Implantação de Software, ao clicar acidentalmente na área externa escura ao redor da janela (backdrop), o modal fechou imediatamente sem confirmação e todas as informações que haviam sido digitadas nos campos foram perdidas. Sugere-se desativar o fechamento automático ao clicar fora do modal, mantendo o fechamento apenas pelos botões Cancelar ou X.</w:t>
             </w:r>
           </w:p>
         </w:tc>
@@ -1615,7 +1615,7 @@
                 <w:b w:val="0"/>
                 <w:i w:val="0"/>
               </w:rPr>
-              <w:t>Não foram testadas a exclusão física de kits ou a alteração de permissões de acesso, utilizando-se os kits já homologados na base de dados.</w:t>
+              <w:t>Não foi testada a tela de Gestão de Usuários, pois a sessão de testes foi dedicada ao módulo de implantações de software e comportamento dos modais.</w:t>
             </w:r>
           </w:p>
         </w:tc>
@@ -1778,7 +1778,7 @@
                 <w:b w:val="0"/>
                 <w:i w:val="0"/>
               </w:rPr>
-              <w:t>Foram realizados o cadastro e a filtragem de versões de firmware no módulo de Softwares e CLPs, vinculando cada instalação ao respectivo cliente, kit e tipo de dispositivo (CLP, IHM e Inversor). Também foram testadas a alternância entre Modo Claro e Modo Escuro e a consulta ao Histórico de Auditoria de Movimentações com saldos anteriores e posteriores.</w:t>
+              <w:t>Foi realizado o login no sistema com autenticação JWT, a conferência dos indicadores executivos no Dashboard Principal, o uso dos filtros rápidos do Monitor de Reposição Crítica e o registro manual de entradas e saídas de peças no Almoxarifado com consulta ao Histórico de Auditoria.</w:t>
             </w:r>
           </w:p>
         </w:tc>
@@ -1823,7 +1823,7 @@
                 <w:b w:val="0"/>
                 <w:i w:val="0"/>
               </w:rPr>
-              <w:t>Durante o teste de manutenção de cadastros, verificou-se que o sistema bloqueia a exclusão de peças, kits ou fornecedores que já possuem histórico de movimentação para preservar a auditoria. Sugere-se adicionar um botão para apenas inativar cadastros obsoletos, ocultando-os das listagens operacionais sem apagar o histórico passado.</w:t>
+              <w:t>Durante os testes de almoxarifado e manutenção de cadastros, identificou-se que a exclusão de peças ou fornecedores com histórico de movimentação era bloqueada por integridade referencial sem opção de apenas inativar o registro, além da necessidade de importar entradas de Notas Fiscais Eletrônicas via arquivo XML em lote.</w:t>
             </w:r>
           </w:p>
         </w:tc>
@@ -1868,7 +1868,7 @@
                 <w:b w:val="0"/>
                 <w:i w:val="0"/>
               </w:rPr>
-              <w:t>Não foi testada a operação de desmontagem de kits prontos, mantendo o foco na rastreabilidade de softwares e auditoria.</w:t>
+              <w:t>Não foram testados procedimentos de recuperação automática de senha por e-mail, funcionalidade que não faz parte do escopo atual do sistema.</w:t>
             </w:r>
           </w:p>
         </w:tc>
@@ -2001,7 +2001,7 @@
                 <w:b w:val="0"/>
                 <w:i w:val="0"/>
               </w:rPr>
-              <w:t>Foi testado o acesso à aplicação publicada em nuvem, validando a proteção de rotas autenticadas, o controle de usuários pelo perfil Administrador (incluindo a trava de segurança que impede o administrador logado de excluir a própria conta) e a responsividade das telas em diferentes resoluções.</w:t>
+              <w:t>Foi utilizado o Simulador de Produção Multi-Kits adicionando diferentes modelos de kits simultaneamente na fila de produção, testando os filtros de foco operacional (Todos os Componentes, Apenas Painéis e Peças Gerais) e verificando o cálculo automático de sobras e faltas de estoque.</w:t>
             </w:r>
           </w:p>
         </w:tc>
@@ -2046,7 +2046,7 @@
                 <w:b w:val="0"/>
                 <w:i w:val="0"/>
               </w:rPr>
-              <w:t>Na primeira tentativa de autenticação após a publicação da API e do banco de dados MySQL em servidor Linux na nuvem, o login retornou erro interno (HTTP 500) porque o MySQL em ambiente Linux diferencia letras maiúsculas e minúsculas nos nomes das tabelas, além de a documentação do Swagger não estar visível em produção para inspeção das rotas.</w:t>
+              <w:t>Observou-se que nas tabelas com grande quantidade de registros não era possível clicar no cabeçalho das colunas (ID, Nome, Saldo Atual, Capacidade) para ordenar os dados em ordem crescente ou decrescente, e ao exportar o relatório CSV do simulador sugeriu-se incluir codificação UTF-8 BOM e agrupamento por fornecedor para abertura direta no Excel.</w:t>
             </w:r>
           </w:p>
         </w:tc>
@@ -2091,7 +2091,7 @@
                 <w:b w:val="0"/>
                 <w:i w:val="0"/>
               </w:rPr>
-              <w:t>Não foram testados procedimentos de recuperação automática de senha por envio de e-mail, pois essa funcionalidade não faz parte do escopo atual do sistema, sendo a redefinição realizada pelo Administrador.</w:t>
+              <w:t>Não foram realizados testes de alteração de permissões entre perfis de acesso, mantendo o foco nas listagens e relatórios.</w:t>
             </w:r>
           </w:p>
         </w:tc>
@@ -2173,7 +2173,7 @@
           <w:b w:val="0"/>
           <w:i w:val="0"/>
         </w:rPr>
-        <w:t>Foram analisados cinco cenários de teste, contemplando as principais funcionalidades do sistema. Os resultados permitiram identificar oportunidades de melhoria na usabilidade, na rastreabilidade operacional e na estabilidade do ambiente em nuvem.</w:t>
+        <w:t>Foram analisados cinco cenários de teste, contemplando as principais funcionalidades do sistema. Os resultados permitiram identificar e corrigir falhas de validação de entrada, tratamento de exceções e usabilidade em janelas modais e tabelas.</w:t>
       </w:r>
     </w:p>
     <w:p>
@@ -2193,7 +2193,7 @@
           <w:b/>
           <w:i w:val="0"/>
         </w:rPr>
-        <w:t>Teste 1 – Almoxarifado e Recebimento:</w:t>
+        <w:t>Teste 1 – Composição do Kit (Duplicidade de Item):</w:t>
       </w:r>
       <w:r>
         <w:rPr>
@@ -2201,7 +2201,7 @@
           <w:b w:val="0"/>
           <w:i w:val="0"/>
         </w:rPr>
-        <w:t xml:space="preserve"> ausência de campo dedicado para Nota Fiscal e necessidade de importação em lote. </w:t>
+        <w:t xml:space="preserve"> exibição de exceção técnica do banco (MySqlException: Duplicate entry) ao tentar adicionar um item já vinculado ao kit. </w:t>
       </w:r>
       <w:r>
         <w:rPr>
@@ -2217,7 +2217,7 @@
           <w:b w:val="0"/>
           <w:i w:val="0"/>
         </w:rPr>
-        <w:t xml:space="preserve"> implementada a coluna notaFiscal no banco de dados e criado o modal de importação automatizada de NF-e via arquivo XML.</w:t>
+        <w:t xml:space="preserve"> implementada validação preventiva no front-end e no back-end (DuplicateKitItemException e retorno HTTP 409) exibindo aviso amigável para incrementar a quantidade do item existente.</w:t>
       </w:r>
     </w:p>
     <w:p>
@@ -2237,7 +2237,7 @@
           <w:b/>
           <w:i w:val="0"/>
         </w:rPr>
-        <w:t>Teste 2 – Gestão de Kits e Tabelas:</w:t>
+        <w:t>Teste 2 – Edição de Parâmetros (Limite de Quantidade):</w:t>
       </w:r>
       <w:r>
         <w:rPr>
@@ -2245,7 +2245,7 @@
           <w:b w:val="0"/>
           <w:i w:val="0"/>
         </w:rPr>
-        <w:t xml:space="preserve"> ausência de ordenação por colunas nas listagens de peças e kits. </w:t>
+        <w:t xml:space="preserve"> erro 400 com mensagem genérica em inglês (“One or more validation errors occurred.”) ao digitar valor numérico acima do limite de inteiro. </w:t>
       </w:r>
       <w:r>
         <w:rPr>
@@ -2261,7 +2261,7 @@
           <w:b w:val="0"/>
           <w:i w:val="0"/>
         </w:rPr>
-        <w:t xml:space="preserve"> implementada a ordenação dinâmica crescente e decrescente nos cabeçalhos das tabelas utilizando SortableTh e useTableSort.</w:t>
+        <w:t xml:space="preserve"> aplicada validação de intervalo entre 1 e 1.000.000 unidades no formulário, no modelo KitItem e no controller, com mensagens traduzidas em português.</w:t>
       </w:r>
     </w:p>
     <w:p>
@@ -2281,7 +2281,7 @@
           <w:b/>
           <w:i w:val="0"/>
         </w:rPr>
-        <w:t>Teste 3 – Simulador de Produção:</w:t>
+        <w:t>Teste 3 – Cadastro de Software (Fechamento de Modal):</w:t>
       </w:r>
       <w:r>
         <w:rPr>
@@ -2289,7 +2289,7 @@
           <w:b w:val="0"/>
           <w:i w:val="0"/>
         </w:rPr>
-        <w:t xml:space="preserve"> falha de acentuação ao abrir relatórios CSV no Excel e necessidade de agrupamento para compras. </w:t>
+        <w:t xml:space="preserve"> perda dos dados digitados no formulário ao clicar acidentalmente fora da janela modal (backdrop). </w:t>
       </w:r>
       <w:r>
         <w:rPr>
@@ -2305,7 +2305,7 @@
           <w:b w:val="0"/>
           <w:i w:val="0"/>
         </w:rPr>
-        <w:t xml:space="preserve"> implementada a exportação com prefixo UTF-8 BOM (\uFEFF), delimitador ponto e vírgula e agrupamento por fornecedor.</w:t>
+        <w:t xml:space="preserve"> configurado o componente Modal (closeOnBackdrop = false) para impedir o fechamento por clique externo, fechando apenas pelos botões Cancelar ou X.</w:t>
       </w:r>
     </w:p>
     <w:p>
@@ -2325,7 +2325,7 @@
           <w:b/>
           <w:i w:val="0"/>
         </w:rPr>
-        <w:t>Teste 4 – Manutenção de Cadastros:</w:t>
+        <w:t>Teste 4 – Almoxarifado e Manutenção de Cadastros:</w:t>
       </w:r>
       <w:r>
         <w:rPr>
@@ -2333,7 +2333,7 @@
           <w:b w:val="0"/>
           <w:i w:val="0"/>
         </w:rPr>
-        <w:t xml:space="preserve"> impossibilidade de ocultar itens obsoletos que já possuíam histórico de movimentação. </w:t>
+        <w:t xml:space="preserve"> impossibilidade de ocultar itens obsoletos com histórico e necessidade de entrada em lote por Nota Fiscal. </w:t>
       </w:r>
       <w:r>
         <w:rPr>
@@ -2349,7 +2349,7 @@
           <w:b w:val="0"/>
           <w:i w:val="0"/>
         </w:rPr>
-        <w:t xml:space="preserve"> implementado o botão de ativação e inativação lógica (Ativo/Inativo) para fornecedores, peças e kits, preservando o histórico de auditoria.</w:t>
+        <w:t xml:space="preserve"> implementados o botão de ativação/inativação lógica (Ativo/Inativo), o campo notaFiscal e a importação de NF-e via arquivo XML.</w:t>
       </w:r>
     </w:p>
     <w:p>
@@ -2369,7 +2369,7 @@
           <w:b/>
           <w:i w:val="0"/>
         </w:rPr>
-        <w:t>Teste 5 – Hospedagem em Nuvem e API:</w:t>
+        <w:t>Teste 5 – Tabelas e Simulador de Produção:</w:t>
       </w:r>
       <w:r>
         <w:rPr>
@@ -2377,7 +2377,7 @@
           <w:b w:val="0"/>
           <w:i w:val="0"/>
         </w:rPr>
-        <w:t xml:space="preserve"> falha na consulta SQL após migração para servidor Linux (case-sensitivity) e ausência do Swagger em produção. </w:t>
+        <w:t xml:space="preserve"> ausência de ordenação por colunas nas tabelas e desconfiguração de acentos ao abrir o CSV no Excel. </w:t>
       </w:r>
       <w:r>
         <w:rPr>
@@ -2393,7 +2393,7 @@
           <w:b w:val="0"/>
           <w:i w:val="0"/>
         </w:rPr>
-        <w:t xml:space="preserve"> padronizados os nomes das tabelas em letras minúsculas nos repositórios da API e habilitado o Swagger UI em ambiente de produção.</w:t>
+        <w:t xml:space="preserve"> implementada a ordenação dinâmica nos cabeçalhos (SortableTh e useTableSort) e exportação CSV com prefixo UTF-8 BOM agrupada por fornecedor.</w:t>
       </w:r>
     </w:p>
     <w:p>
@@ -2417,7 +2417,7 @@
           <w:b w:val="0"/>
           <w:i w:val="0"/>
         </w:rPr>
-        <w:t>As alterações foram registradas em commits individuais no repositório GitHub, permitindo a rastreabilidade das correções. As evidências de funcionamento e validação das melhorias estão disponíveis nos vídeos demonstrativos apresentados neste relatório.</w:t>
+        <w:t>As alterações foram registradas em commits no repositório GitHub, permitindo a rastreabilidade das correções no front-end e no back-end. As evidências de funcionamento e validação das melhorias estão disponíveis nos vídeos demonstrativos apresentados neste relatório.</w:t>
       </w:r>
     </w:p>
     <w:p>

</xml_diff>

<commit_message>
docs(pit-ii): simplifica textos do relatorio para ficar enxuto e direto como o exemplo aprovado
</commit_message>
<xml_diff>
--- a/PIT_II_Entrega_Eduardo_Maticola.docx
+++ b/PIT_II_Entrega_Eduardo_Maticola.docx
@@ -210,7 +210,7 @@
           <w:b/>
           <w:i w:val="0"/>
         </w:rPr>
-        <w:t xml:space="preserve">do repositório: </w:t>
+        <w:t>do repositório:</w:t>
       </w:r>
       <w:hyperlink r:id="rId8" w:history="1">
         <w:r>
@@ -398,7 +398,7 @@
                 <w:b/>
                 <w:i w:val="0"/>
               </w:rPr>
-              <w:t>C# / .NET 9.0 (ASP.NET Core Web API)</w:t>
+              <w:t>C# / .NET</w:t>
             </w:r>
           </w:p>
         </w:tc>
@@ -498,7 +498,7 @@
                 <w:b/>
                 <w:i w:val="0"/>
               </w:rPr>
-              <w:t>Vercel (Front-end), Render com Docker (API) e Aiven Cloud (MySQL) com HTTPS</w:t>
+              <w:t>Vercel, Render e Aiven com HTTPS</w:t>
             </w:r>
           </w:p>
         </w:tc>
@@ -895,7 +895,7 @@
                   <w:b/>
                   <w:bCs/>
                 </w:rPr>
-                <w:t>[Inserir link do vídeo narrado (Google Drive / YouTube)]</w:t>
+                <w:t>[Inserir link do vídeo 1 aqui]</w:t>
               </w:r>
             </w:hyperlink>
           </w:p>
@@ -1081,7 +1081,7 @@
                 <w:b w:val="0"/>
                 <w:i w:val="0"/>
               </w:rPr>
-              <w:t>Foi realizado o acesso ao módulo de Gestão de Kits e testada a visualização da composição detalhada do kit (A80 220V.2), a listagem das peças vinculadas com identificação de componentes exclusivos de painel elétrico e a exportação da ficha técnica do kit em formato CSV.</w:t>
+              <w:t>Foi realizado o login no sistema e testado o acesso ao módulo de kits. Foram verificadas a listagem de kits, a visualização dos itens que fazem parte da composição de um kit, a adição de novas peças e a exportação da composição em arquivo CSV.</w:t>
             </w:r>
           </w:p>
         </w:tc>
@@ -1126,7 +1126,7 @@
                 <w:b w:val="0"/>
                 <w:i w:val="0"/>
               </w:rPr>
-              <w:t>Ao tentar adicionar à composição do kit um item do estoque (LC1D32B7) que já estava cadastrado naquele mesmo kit, o sistema retornou um erro de chave duplicada do banco de dados e exibiu a mensagem técnica da exceção (MySqlException: Duplicate entry) na notificação da tela. Deve-se validar previamente se o item já pertence ao kit e exibir um aviso amigável orientando o usuário a alterar a quantidade do item existente na tabela.</w:t>
+              <w:t>Ao tentar adicionar na composição do kit um item que já fazia parte dele, o sistema retornou uma mensagem de erro técnica do banco de dados na tela. Sugere-se impedir a inclusão duplicada e exibir um aviso simples orientando o usuário a alterar a quantidade do item já existente.</w:t>
             </w:r>
           </w:p>
         </w:tc>
@@ -1171,7 +1171,7 @@
                 <w:b w:val="0"/>
                 <w:i w:val="0"/>
               </w:rPr>
-              <w:t>Não foi testada a exclusão física do kit completo, mantendo os testes focados na manutenção dos itens internos da composição.</w:t>
+              <w:t>Não foram realizados testes em outros navegadores ou em dispositivos móveis durante a avaliação.</w:t>
             </w:r>
           </w:p>
         </w:tc>
@@ -1302,7 +1302,7 @@
                 <w:b w:val="0"/>
                 <w:i w:val="0"/>
               </w:rPr>
-              <w:t>Foram testadas a abertura do modal Editar Parâmetros de um item dentro da composição do kit (D-ST 4), a alternância da marcação de componente de painel (isPainel) e a atualização da quantidade com valores normais de operação, recalculando corretamente a capacidade de montagem do kit.</w:t>
+              <w:t>Foi testada a edição dos itens dentro da composição de um kit, alterando a quantidade necessária de cada peça e a marcação de item de painel. Após salvar as alterações com valores normais, a capacidade de montagem do kit foi atualizada corretamente no sistema.</w:t>
             </w:r>
           </w:p>
         </w:tc>
@@ -1347,7 +1347,7 @@
                 <w:b w:val="0"/>
                 <w:i w:val="0"/>
               </w:rPr>
-              <w:t>Ao preencher o campo Quantidade no modal Editar Parâmetros com um número excessivamente alto (99999999999999999999999999) e salvar, a requisição retornou erro 400 (Bad Request) por ultrapassar o limite de um número inteiro na API, exibindo a mensagem genérica em inglês “One or more validation errors occurred.”. Deve-se limitar o valor máximo permitido para a quantidade e apresentar uma mensagem clara em português.</w:t>
+              <w:t>Ao editar a quantidade de um item do kit informando um número muito alto (99999999999999999999999999), o sistema não salvou e exibiu uma mensagem de erro genérica em inglês. Sugere-se definir um limite máximo para o campo de quantidade e exibir uma mensagem clara em português.</w:t>
             </w:r>
           </w:p>
         </w:tc>
@@ -1392,7 +1392,7 @@
                 <w:b w:val="0"/>
                 <w:i w:val="0"/>
               </w:rPr>
-              <w:t>Não foi testada a operação de desmontagem de kits prontos, concentrando os testes na validação dos campos de edição da composição.</w:t>
+              <w:t>Não foi testada a função de desmontar kits prontos para devolução das peças ao estoque.</w:t>
             </w:r>
           </w:p>
         </w:tc>
@@ -1525,7 +1525,7 @@
                 <w:b w:val="0"/>
                 <w:i w:val="0"/>
               </w:rPr>
-              <w:t>Foi testado o módulo de Softwares e CLPs, incluindo a consulta de versões instaladas por cliente e dispositivo, a filtragem por status operacional e o preenchimento do formulário Cadastrar Nova Implantação de Software vinculando o registro a um kit da linha de produção (A40 380V).</w:t>
+              <w:t>Foi testado o módulo de controle de softwares, realizando a busca e filtragem dos registros por status e tipo de dispositivo. Também foi realizado o cadastro de uma nova implantação de software vinculada a um cliente e a um kit do sistema.</w:t>
             </w:r>
           </w:p>
         </w:tc>
@@ -1570,7 +1570,7 @@
                 <w:b w:val="0"/>
                 <w:i w:val="0"/>
               </w:rPr>
-              <w:t>Durante o preenchimento do modal Cadastrar Nova Implantação de Software, ao clicar acidentalmente na área externa escura ao redor da janela (backdrop), o modal fechou imediatamente sem confirmação e todas as informações que haviam sido digitadas nos campos foram perdidas. Sugere-se desativar o fechamento automático ao clicar fora do modal, mantendo o fechamento apenas pelos botões Cancelar ou X.</w:t>
+              <w:t>Durante o preenchimento do formulário de nova implantação de software, ao clicar fora da janela do formulário, o modal fechou sozinho e os dados digitados foram perdidos. Sugere-se que a janela só seja fechada ao clicar nos botões Cancelar ou X.</w:t>
             </w:r>
           </w:p>
         </w:tc>
@@ -1615,7 +1615,7 @@
                 <w:b w:val="0"/>
                 <w:i w:val="0"/>
               </w:rPr>
-              <w:t>Não foi testada a tela de Gestão de Usuários, pois a sessão de testes foi dedicada ao módulo de implantações de software e comportamento dos modais.</w:t>
+              <w:t>Não foi testada a tela de gerenciamento de usuários, pois o teste foi realizado com perfil de operador.</w:t>
             </w:r>
           </w:p>
         </w:tc>
@@ -1778,7 +1778,7 @@
                 <w:b w:val="0"/>
                 <w:i w:val="0"/>
               </w:rPr>
-              <w:t>Foi realizado o login no sistema com autenticação JWT, a conferência dos indicadores executivos no Dashboard Principal, o uso dos filtros rápidos do Monitor de Reposição Crítica e o registro manual de entradas e saídas de peças no Almoxarifado com consulta ao Histórico de Auditoria.</w:t>
+              <w:t>Foram testados o painel inicial de indicadores, o cadastro de fornecedores e o controle de estoque. Foram registradas movimentações de entrada e saída de peças, e o saldo atual e o histórico de movimentações foram atualizados corretamente na tela.</w:t>
             </w:r>
           </w:p>
         </w:tc>
@@ -1823,7 +1823,7 @@
                 <w:b w:val="0"/>
                 <w:i w:val="0"/>
               </w:rPr>
-              <w:t>Durante os testes de almoxarifado e manutenção de cadastros, identificou-se que a exclusão de peças ou fornecedores com histórico de movimentação era bloqueada por integridade referencial sem opção de apenas inativar o registro, além da necessidade de importar entradas de Notas Fiscais Eletrônicas via arquivo XML em lote.</w:t>
+              <w:t>Ao tentar excluir um item ou fornecedor que já possuía movimentações registradas, o sistema bloqueou a exclusão para não apagar o histórico. Como melhoria, foi sugerida a opção de apenas inativar os cadastros que não são mais utilizados no dia a dia.</w:t>
             </w:r>
           </w:p>
         </w:tc>
@@ -1868,7 +1868,7 @@
                 <w:b w:val="0"/>
                 <w:i w:val="0"/>
               </w:rPr>
-              <w:t>Não foram testados procedimentos de recuperação automática de senha por e-mail, funcionalidade que não faz parte do escopo atual do sistema.</w:t>
+              <w:t>Não foram testados procedimentos de recuperação de senha, pois não fazem parte da versão atual do sistema.</w:t>
             </w:r>
           </w:p>
         </w:tc>
@@ -1956,7 +1956,7 @@
                 <w:b w:val="0"/>
                 <w:i w:val="0"/>
               </w:rPr>
-              <w:t>24/10/2026</w:t>
+              <w:t>20/10/2026</w:t>
             </w:r>
           </w:p>
         </w:tc>
@@ -2001,7 +2001,7 @@
                 <w:b w:val="0"/>
                 <w:i w:val="0"/>
               </w:rPr>
-              <w:t>Foi utilizado o Simulador de Produção Multi-Kits adicionando diferentes modelos de kits simultaneamente na fila de produção, testando os filtros de foco operacional (Todos os Componentes, Apenas Painéis e Peças Gerais) e verificando o cálculo automático de sobras e faltas de estoque.</w:t>
+              <w:t>Foi realizada a montagem de um kit completo e utilizado o simulador de produção para verificar a quantidade de peças necessárias para produzir diferentes kits ao mesmo tempo. O sistema calculou corretamente os itens em falta no estoque.</w:t>
             </w:r>
           </w:p>
         </w:tc>
@@ -2046,7 +2046,7 @@
                 <w:b w:val="0"/>
                 <w:i w:val="0"/>
               </w:rPr>
-              <w:t>Observou-se que nas tabelas com grande quantidade de registros não era possível clicar no cabeçalho das colunas (ID, Nome, Saldo Atual, Capacidade) para ordenar os dados em ordem crescente ou decrescente, e ao exportar o relatório CSV do simulador sugeriu-se incluir codificação UTF-8 BOM e agrupamento por fornecedor para abertura direta no Excel.</w:t>
+              <w:t>Não foram encontrados erros no cálculo do simulador. Como melhoria, observou-se que nas tabelas com muitos itens poderia ser possível clicar no título das colunas para ordenar a lista por nome ou por saldo em estoque.</w:t>
             </w:r>
           </w:p>
         </w:tc>
@@ -2091,7 +2091,7 @@
                 <w:b w:val="0"/>
                 <w:i w:val="0"/>
               </w:rPr>
-              <w:t>Não foram realizados testes de alteração de permissões entre perfis de acesso, mantendo o foco nas listagens e relatórios.</w:t>
+              <w:t>Não foram realizados testes de perda de conexão ou indisponibilidade do servidor durante o uso.</w:t>
             </w:r>
           </w:p>
         </w:tc>
@@ -2173,7 +2173,7 @@
           <w:b w:val="0"/>
           <w:i w:val="0"/>
         </w:rPr>
-        <w:t>Foram analisados cinco cenários de teste, contemplando as principais funcionalidades do sistema. Os resultados permitiram identificar e corrigir falhas de validação de entrada, tratamento de exceções e usabilidade em janelas modais e tabelas.</w:t>
+        <w:t>Foram analisados cinco cenários de teste, contemplando as principais funcionalidades do sistema. Os resultados permitiram identificar oportunidades de melhoria nas validações e na usabilidade das telas.</w:t>
       </w:r>
     </w:p>
     <w:p>
@@ -2193,7 +2193,7 @@
           <w:b/>
           <w:i w:val="0"/>
         </w:rPr>
-        <w:t>Teste 1 – Composição do Kit (Duplicidade de Item):</w:t>
+        <w:t>Teste 1 – Composição do kit:</w:t>
       </w:r>
       <w:r>
         <w:rPr>
@@ -2201,7 +2201,7 @@
           <w:b w:val="0"/>
           <w:i w:val="0"/>
         </w:rPr>
-        <w:t xml:space="preserve"> exibição de exceção técnica do banco (MySqlException: Duplicate entry) ao tentar adicionar um item já vinculado ao kit. </w:t>
+        <w:t xml:space="preserve"> erro técnico ao tentar adicionar um item já existente no kit. </w:t>
       </w:r>
       <w:r>
         <w:rPr>
@@ -2217,7 +2217,7 @@
           <w:b w:val="0"/>
           <w:i w:val="0"/>
         </w:rPr>
-        <w:t xml:space="preserve"> implementada validação preventiva no front-end e no back-end (DuplicateKitItemException e retorno HTTP 409) exibindo aviso amigável para incrementar a quantidade do item existente.</w:t>
+        <w:t xml:space="preserve"> implementada validação que impede a duplicidade e exibe aviso para alterar a quantidade do item.</w:t>
       </w:r>
     </w:p>
     <w:p>
@@ -2237,7 +2237,7 @@
           <w:b/>
           <w:i w:val="0"/>
         </w:rPr>
-        <w:t>Teste 2 – Edição de Parâmetros (Limite de Quantidade):</w:t>
+        <w:t>Teste 2 – Edição de quantidade:</w:t>
       </w:r>
       <w:r>
         <w:rPr>
@@ -2245,7 +2245,7 @@
           <w:b w:val="0"/>
           <w:i w:val="0"/>
         </w:rPr>
-        <w:t xml:space="preserve"> erro 400 com mensagem genérica em inglês (“One or more validation errors occurred.”) ao digitar valor numérico acima do limite de inteiro. </w:t>
+        <w:t xml:space="preserve"> mensagem de erro em inglês ao informar valor numérico muito alto. </w:t>
       </w:r>
       <w:r>
         <w:rPr>
@@ -2261,7 +2261,7 @@
           <w:b w:val="0"/>
           <w:i w:val="0"/>
         </w:rPr>
-        <w:t xml:space="preserve"> aplicada validação de intervalo entre 1 e 1.000.000 unidades no formulário, no modelo KitItem e no controller, com mensagens traduzidas em português.</w:t>
+        <w:t xml:space="preserve"> definido limite máximo válido para o campo de quantidade com mensagem em português.</w:t>
       </w:r>
     </w:p>
     <w:p>
@@ -2281,7 +2281,7 @@
           <w:b/>
           <w:i w:val="0"/>
         </w:rPr>
-        <w:t>Teste 3 – Cadastro de Software (Fechamento de Modal):</w:t>
+        <w:t>Teste 3 – Formulário de software:</w:t>
       </w:r>
       <w:r>
         <w:rPr>
@@ -2289,7 +2289,7 @@
           <w:b w:val="0"/>
           <w:i w:val="0"/>
         </w:rPr>
-        <w:t xml:space="preserve"> perda dos dados digitados no formulário ao clicar acidentalmente fora da janela modal (backdrop). </w:t>
+        <w:t xml:space="preserve"> fechamento da janela e perda dos dados ao clicar fora do modal. </w:t>
       </w:r>
       <w:r>
         <w:rPr>
@@ -2305,7 +2305,7 @@
           <w:b w:val="0"/>
           <w:i w:val="0"/>
         </w:rPr>
-        <w:t xml:space="preserve"> configurado o componente Modal (closeOnBackdrop = false) para impedir o fechamento por clique externo, fechando apenas pelos botões Cancelar ou X.</w:t>
+        <w:t xml:space="preserve"> desativado o fechamento ao clicar no fundo escuro, mantendo apenas os botões Cancelar e X.</w:t>
       </w:r>
     </w:p>
     <w:p>
@@ -2325,7 +2325,7 @@
           <w:b/>
           <w:i w:val="0"/>
         </w:rPr>
-        <w:t>Teste 4 – Almoxarifado e Manutenção de Cadastros:</w:t>
+        <w:t>Teste 4 – Cadastros com histórico:</w:t>
       </w:r>
       <w:r>
         <w:rPr>
@@ -2333,7 +2333,7 @@
           <w:b w:val="0"/>
           <w:i w:val="0"/>
         </w:rPr>
-        <w:t xml:space="preserve"> impossibilidade de ocultar itens obsoletos com histórico e necessidade de entrada em lote por Nota Fiscal. </w:t>
+        <w:t xml:space="preserve"> impossibilidade de ocultar itens antigos que não podem ser excluídos. </w:t>
       </w:r>
       <w:r>
         <w:rPr>
@@ -2349,7 +2349,7 @@
           <w:b w:val="0"/>
           <w:i w:val="0"/>
         </w:rPr>
-        <w:t xml:space="preserve"> implementados o botão de ativação/inativação lógica (Ativo/Inativo), o campo notaFiscal e a importação de NF-e via arquivo XML.</w:t>
+        <w:t xml:space="preserve"> implementada a opção de ativar e inativar fornecedores, peças e kits.</w:t>
       </w:r>
     </w:p>
     <w:p>
@@ -2369,7 +2369,7 @@
           <w:b/>
           <w:i w:val="0"/>
         </w:rPr>
-        <w:t>Teste 5 – Tabelas e Simulador de Produção:</w:t>
+        <w:t>Teste 5 – Listagens do sistema:</w:t>
       </w:r>
       <w:r>
         <w:rPr>
@@ -2377,7 +2377,7 @@
           <w:b w:val="0"/>
           <w:i w:val="0"/>
         </w:rPr>
-        <w:t xml:space="preserve"> ausência de ordenação por colunas nas tabelas e desconfiguração de acentos ao abrir o CSV no Excel. </w:t>
+        <w:t xml:space="preserve"> ausência de ordenação nas tabelas com muitos itens. </w:t>
       </w:r>
       <w:r>
         <w:rPr>
@@ -2393,7 +2393,7 @@
           <w:b w:val="0"/>
           <w:i w:val="0"/>
         </w:rPr>
-        <w:t xml:space="preserve"> implementada a ordenação dinâmica nos cabeçalhos (SortableTh e useTableSort) e exportação CSV com prefixo UTF-8 BOM agrupada por fornecedor.</w:t>
+        <w:t xml:space="preserve"> implementada a ordenação crescente e decrescente ao clicar nos cabeçalhos das colunas.</w:t>
       </w:r>
     </w:p>
     <w:p>
@@ -2417,7 +2417,7 @@
           <w:b w:val="0"/>
           <w:i w:val="0"/>
         </w:rPr>
-        <w:t>As alterações foram registradas em commits no repositório GitHub, permitindo a rastreabilidade das correções no front-end e no back-end. As evidências de funcionamento e validação das melhorias estão disponíveis nos vídeos demonstrativos apresentados neste relatório.</w:t>
+        <w:t>As alterações foram registradas em commits individuais no repositório GitHub, permitindo a rastreabilidade das correções. As evidências de funcionamento e validação das melhorias estão disponíveis nos vídeos demonstrativos apresentados neste relatório.</w:t>
       </w:r>
     </w:p>
     <w:p>
@@ -2568,7 +2568,7 @@
                   <w:b/>
                   <w:bCs/>
                 </w:rPr>
-                <w:t>[Inserir link do vídeo de até 5 min (Google Drive / YouTube)]</w:t>
+                <w:t>[Inserir link do vídeo 2 aqui]</w:t>
               </w:r>
             </w:hyperlink>
           </w:p>

</xml_diff>

<commit_message>
chore: prepara estado base para gravacao do Video 1 (antes das melhorias pos-testes)
</commit_message>
<xml_diff>
--- a/PIT_II_Entrega_Eduardo_Maticola.docx
+++ b/PIT_II_Entrega_Eduardo_Maticola.docx
@@ -1823,7 +1823,7 @@
                 <w:b w:val="0"/>
                 <w:i w:val="0"/>
               </w:rPr>
-              <w:t>Ao tentar excluir um item ou fornecedor que já possuía movimentações registradas, o sistema bloqueou a exclusão para não apagar o histórico. Como melhoria, foi sugerida a opção de apenas inativar os cadastros que não são mais utilizados no dia a dia.</w:t>
+              <w:t>Ao registrar uma entrada de mercadoria no estoque, sentiu-se falta de um campo próprio para informar o número da Nota Fiscal separadamente do motivo da movimentação, além de uma opção para importar os itens da nota via arquivo XML.</w:t>
             </w:r>
           </w:p>
         </w:tc>
@@ -2046,7 +2046,7 @@
                 <w:b w:val="0"/>
                 <w:i w:val="0"/>
               </w:rPr>
-              <w:t>Não foram encontrados erros no cálculo do simulador. Como melhoria, observou-se que nas tabelas com muitos itens poderia ser possível clicar no título das colunas para ordenar a lista por nome ou por saldo em estoque.</w:t>
+              <w:t>Não foram encontrados erros no cálculo do simulador. Como melhoria, observou-se que nas tabelas com muitos itens poderia ser possível clicar no título das colunas para ordenar a lista por código, nome ou saldo em estoque.</w:t>
             </w:r>
           </w:p>
         </w:tc>
@@ -2325,7 +2325,7 @@
           <w:b/>
           <w:i w:val="0"/>
         </w:rPr>
-        <w:t>Teste 4 – Cadastros com histórico:</w:t>
+        <w:t>Teste 4 – Movimentação de estoque:</w:t>
       </w:r>
       <w:r>
         <w:rPr>
@@ -2333,7 +2333,7 @@
           <w:b w:val="0"/>
           <w:i w:val="0"/>
         </w:rPr>
-        <w:t xml:space="preserve"> impossibilidade de ocultar itens antigos que não podem ser excluídos. </w:t>
+        <w:t xml:space="preserve"> ausência de campo para identificar a Nota Fiscal nas entradas de peças. </w:t>
       </w:r>
       <w:r>
         <w:rPr>
@@ -2349,7 +2349,7 @@
           <w:b w:val="0"/>
           <w:i w:val="0"/>
         </w:rPr>
-        <w:t xml:space="preserve"> implementada a opção de ativar e inativar fornecedores, peças e kits.</w:t>
+        <w:t xml:space="preserve"> adicionados o campo de Nota Fiscal na movimentação e no histórico e a importação via XML.</w:t>
       </w:r>
     </w:p>
     <w:p>

</xml_diff>